<commit_message>
Add structured trace readiness checks and pre-flight prototype detection
Replaces the guide draft system prompt with a comprehensive version that
evaluates trace quality before generating content, including explicit
blocked states for prototype and zero-transcript traces. Adds local
pre-flight detection in generate_guide_draft.py so prototype traces
never reach the API.
</commit_message>
<xml_diff>
--- a/docs/prototype-collateral/KCXDocumentor - Anthropic API Data Protection Brief.docx
+++ b/docs/prototype-collateral/KCXDocumentor - Anthropic API Data Protection Brief.docx
@@ -49,7 +49,7 @@
           <w:color w:val="1C75BC"/>
           <w:sz w:val="48"/>
         </w:rPr>
-        <w:t>KCXDocumentor - Anthropic API Data Protection Brief</w:t>
+        <w:t>KCXDocumentor - Azure Foundry Claude Data Protection Brief</w:t>
       </w:r>
     </w:p>
     <w:p>
@@ -59,7 +59,7 @@
           <w:color w:val="6B7280"/>
           <w:sz w:val="24"/>
         </w:rPr>
-        <w:t>Executive review of API data use, PHI/PII exposure, and BAA readiness</w:t>
+        <w:t>Executive review of AI data flow, PHI/PII exposure, Marketplace billing, and compliance readiness</w:t>
       </w:r>
     </w:p>
     <w:tbl>
@@ -108,7 +108,7 @@
                 <w:color w:val="1F2937"/>
                 <w:sz w:val="20"/>
               </w:rPr>
-              <w:t>Built as a keycentrix internal artifact using the DamienDev document recipe structure: control metadata, version history, purpose, scope, audience, governance, process detail, and appendices.</w:t>
+              <w:t>Built as a keycentrix internal artifact using the KCX document standard: control metadata, version history, purpose, scope, audience, governance, process detail, and appendices.</w:t>
             </w:r>
           </w:p>
         </w:tc>
@@ -360,7 +360,7 @@
                 <w:color w:val="1F2937"/>
                 <w:sz w:val="19"/>
               </w:rPr>
-              <w:t>2026-06-05</w:t>
+              <w:t>2026-06-07</w:t>
             </w:r>
           </w:p>
         </w:tc>
@@ -604,7 +604,7 @@
                 <w:color w:val="1F2937"/>
                 <w:sz w:val="19"/>
               </w:rPr>
-              <w:t>DamienDev document recipe</w:t>
+              <w:t>KCX document standard</w:t>
             </w:r>
           </w:p>
         </w:tc>
@@ -747,7 +747,7 @@
                 <w:color w:val="1F2937"/>
                 <w:sz w:val="19"/>
               </w:rPr>
-              <w:t>KCXDocumentor - Anthropic API Data Protection Brief</w:t>
+              <w:t>KCXDocumentor - Azure Foundry Claude Data Protection Brief</w:t>
             </w:r>
           </w:p>
         </w:tc>
@@ -1052,7 +1052,7 @@
                 <w:color w:val="1F2937"/>
                 <w:sz w:val="19"/>
               </w:rPr>
-              <w:t>Anthropic public documentation reviewed on 2026-06-05</w:t>
+              <w:t>Microsoft Foundry Claude and Anthropic API documentation reviewed on 2026-06-07</w:t>
             </w:r>
           </w:p>
         </w:tc>
@@ -1247,7 +1247,97 @@
                 <w:color w:val="1F2937"/>
                 <w:sz w:val="19"/>
               </w:rPr>
-              <w:t>Initial executive data protection and BAA readiness brief.</w:t>
+              <w:t>Initial first-party Anthropic API data protection and BAA readiness brief.</w:t>
+            </w:r>
+          </w:p>
+        </w:tc>
+      </w:tr>
+      <w:tr>
+        <w:tc>
+          <w:tcPr>
+            <w:tcW w:type="dxa" w:w="3360"/>
+            <w:vAlign w:val="center"/>
+            <w:shd w:fill="F3F4F6"/>
+            <w:tcMar>
+              <w:top w:w="80" w:type="dxa"/>
+              <w:start w:w="120" w:type="dxa"/>
+              <w:bottom w:w="80" w:type="dxa"/>
+              <w:end w:w="120" w:type="dxa"/>
+            </w:tcMar>
+            <w:tcBorders>
+              <w:top w:val="single" w:sz="4" w:color="D7DDE0"/>
+              <w:left w:val="single" w:sz="4" w:color="D7DDE0"/>
+              <w:bottom w:val="single" w:sz="4" w:color="D7DDE0"/>
+              <w:right w:val="single" w:sz="4" w:color="D7DDE0"/>
+            </w:tcBorders>
+          </w:tcPr>
+          <w:p>
+            <w:r>
+              <w:rPr>
+                <w:rFonts w:ascii="Calibri" w:hAnsi="Calibri"/>
+                <w:b/>
+                <w:color w:val="1F2937"/>
+                <w:sz w:val="19"/>
+              </w:rPr>
+              <w:t>2.0</w:t>
+            </w:r>
+          </w:p>
+        </w:tc>
+        <w:tc>
+          <w:tcPr>
+            <w:tcW w:type="dxa" w:w="3360"/>
+            <w:vAlign w:val="center"/>
+            <w:shd w:fill="FFFFFF"/>
+            <w:tcMar>
+              <w:top w:w="80" w:type="dxa"/>
+              <w:start w:w="120" w:type="dxa"/>
+              <w:bottom w:w="80" w:type="dxa"/>
+              <w:end w:w="120" w:type="dxa"/>
+            </w:tcMar>
+            <w:tcBorders>
+              <w:top w:val="single" w:sz="4" w:color="D7DDE0"/>
+              <w:left w:val="single" w:sz="4" w:color="D7DDE0"/>
+              <w:bottom w:val="single" w:sz="4" w:color="D7DDE0"/>
+              <w:right w:val="single" w:sz="4" w:color="D7DDE0"/>
+            </w:tcBorders>
+          </w:tcPr>
+          <w:p>
+            <w:r>
+              <w:rPr>
+                <w:rFonts w:ascii="Calibri" w:hAnsi="Calibri"/>
+                <w:color w:val="1F2937"/>
+                <w:sz w:val="19"/>
+              </w:rPr>
+              <w:t>2026-06-07</w:t>
+            </w:r>
+          </w:p>
+        </w:tc>
+        <w:tc>
+          <w:tcPr>
+            <w:tcW w:type="dxa" w:w="3360"/>
+            <w:vAlign w:val="center"/>
+            <w:shd w:fill="FFFFFF"/>
+            <w:tcMar>
+              <w:top w:w="80" w:type="dxa"/>
+              <w:start w:w="120" w:type="dxa"/>
+              <w:bottom w:w="80" w:type="dxa"/>
+              <w:end w:w="120" w:type="dxa"/>
+            </w:tcMar>
+            <w:tcBorders>
+              <w:top w:val="single" w:sz="4" w:color="D7DDE0"/>
+              <w:left w:val="single" w:sz="4" w:color="D7DDE0"/>
+              <w:bottom w:val="single" w:sz="4" w:color="D7DDE0"/>
+              <w:right w:val="single" w:sz="4" w:color="D7DDE0"/>
+            </w:tcBorders>
+          </w:tcPr>
+          <w:p>
+            <w:r>
+              <w:rPr>
+                <w:rFonts w:ascii="Calibri" w:hAnsi="Calibri"/>
+                <w:color w:val="1F2937"/>
+                <w:sz w:val="19"/>
+              </w:rPr>
+              <w:t>Updated for Azure Foundry Claude, Azure Function proxy, Cosmos usage reporting, and Marketplace billing caveats.</w:t>
             </w:r>
           </w:p>
         </w:tc>
@@ -1264,7 +1354,7 @@
     </w:p>
     <w:p>
       <w:r>
-        <w:t>Summarize Anthropic API data-use protections and the additional requirements needed before KCXDocumentor is used with protected health information or sensitive personal information.</w:t>
+        <w:t>Summarize the current KCXDocumentor AI provider path and the protections, caveats, and product controls needed before the application is used with protected health information or sensitive personal information.</w:t>
       </w:r>
     </w:p>
     <w:p>
@@ -1277,7 +1367,7 @@
     </w:p>
     <w:p>
       <w:r>
-        <w:t>Focused on KCXDocumentor use of Anthropic's first-party API for guide generation. This brief does not evaluate Claude consumer products, Claude Team plans, partner-hosted model platforms, or third-party integrations.</w:t>
+        <w:t>Focused on KCXDocumentor guide generation through Microsoft Foundry Claude Sonnet 4.6 behind an authenticated Azure Function proxy. This brief does not evaluate Claude consumer products, Claude Team or Enterprise product interfaces, direct Anthropic API production use, or unrelated third-party integrations.</w:t>
       </w:r>
     </w:p>
     <w:p>
@@ -1347,7 +1437,7 @@
                 <w:color w:val="1F2937"/>
                 <w:sz w:val="20"/>
               </w:rPr>
-              <w:t>KCXDocumentor should continue using the local-first architecture, but production use with PHI should wait until Anthropic HIPAA-ready API access is enabled under a signed BAA and the application enforces PHI-aware controls.</w:t>
+              <w:t>KCXDocumentor may continue the pilot with synthetic, internal, or de-identified recordings using the current Azure Foundry Claude path. PHI-bearing production use should wait until Security and Compliance confirm the selected Foundry Claude Marketplace terms, Anthropic processor terms, Microsoft DPA posture, region behavior, and PHI-mode controls are acceptable.</w:t>
             </w:r>
           </w:p>
         </w:tc>
@@ -1359,7 +1449,7 @@
         <w:pStyle w:val="ListBullet"/>
       </w:pPr>
       <w:r>
-        <w:t>Anthropic's Commercial Terms state that customer inputs and outputs remain customer content and are not used to train Anthropic models.</w:t>
+        <w:t>The desktop app no longer calls Anthropic directly. It sends compact prompt data to the authenticated Azure Function configured for Azure Foundry Claude.</w:t>
       </w:r>
     </w:p>
     <w:p>
@@ -1367,7 +1457,7 @@
         <w:pStyle w:val="ListBullet"/>
       </w:pPr>
       <w:r>
-        <w:t>Anthropic's published standard API retention says API inputs and outputs are automatically deleted within 30 days, subject to exceptions for law, usage-policy enforcement, certain longer-retention features, or agreed alternatives.</w:t>
+        <w:t>Raw recordings, extracted audio, frame sets, OCR artifacts, processed traces, DOCX files, and local QA artifacts remain on the workstation.</w:t>
       </w:r>
     </w:p>
     <w:p>
@@ -1375,7 +1465,7 @@
         <w:pStyle w:val="ListBullet"/>
       </w:pPr>
       <w:r>
-        <w:t>Anthropic offers zero data retention arrangements for eligible enterprise API customers and HIPAA-ready API access with a signed Business Associate Agreement.</w:t>
+        <w:t>The Azure Function validates the signed-in user, schedules generation, calls Azure Foundry Claude, records success or failure usage, and stores AI Spend metadata in Cosmos DB.</w:t>
       </w:r>
     </w:p>
     <w:p>
@@ -1383,7 +1473,7 @@
         <w:pStyle w:val="ListBullet"/>
       </w:pPr>
       <w:r>
-        <w:t>For KCXDocumentor, raw recordings stay local, but transcript excerpts, OCR text, reviewer notes, approved screenshot context, and generated guide content can still contain PHI or PII if the source recording contains it.</w:t>
+        <w:t>Microsoft documentation for Claude in Foundry states that Anthropic is the processor for prompts and outputs, while Microsoft manages the API deployment infrastructure and billing/usage processing.</w:t>
       </w:r>
     </w:p>
     <w:p>
@@ -1391,7 +1481,15 @@
         <w:pStyle w:val="ListBullet"/>
       </w:pPr>
       <w:r>
-        <w:t>Until BAA coverage and HIPAA-ready API organization controls are active, the safest operating rule is to avoid sending PHI to Anthropic and to use de-identified or internal-only test data.</w:t>
+        <w:t>Claude in Foundry is a Microsoft Marketplace model path. Marketplace billing and model-publisher terms must be reviewed separately from standard Azure credits or ordinary Azure service assumptions.</w:t>
+      </w:r>
+    </w:p>
+    <w:p>
+      <w:pPr>
+        <w:pStyle w:val="ListBullet"/>
+      </w:pPr>
+      <w:r>
+        <w:t>For PHI/PII risk, the sensitive transmission points are transcript excerpts, OCR text, reviewer notes, approved screenshot context, and generated guide content, not the raw video file.</w:t>
       </w:r>
     </w:p>
     <w:p>
@@ -1399,7 +1497,652 @@
         <w:pStyle w:val="Heading1"/>
       </w:pPr>
       <w:r>
-        <w:t>KCXDocumentor Data Flow Considerations</w:t>
+        <w:t>Current KCXDocumentor AI Path</w:t>
+      </w:r>
+    </w:p>
+    <w:tbl>
+      <w:tblPr>
+        <w:tblStyle w:val="TableGrid"/>
+        <w:tblW w:type="auto" w:w="0"/>
+        <w:jc w:val="center"/>
+        <w:tblLook w:firstColumn="1" w:firstRow="1" w:lastColumn="0" w:lastRow="0" w:noHBand="0" w:noVBand="1" w:val="04A0"/>
+      </w:tblPr>
+      <w:tblGrid>
+        <w:gridCol w:w="3360"/>
+        <w:gridCol w:w="3360"/>
+        <w:gridCol w:w="3360"/>
+      </w:tblGrid>
+      <w:tr>
+        <w:tc>
+          <w:tcPr>
+            <w:tcW w:type="dxa" w:w="3360"/>
+            <w:shd w:fill="1C75BC"/>
+            <w:tcMar>
+              <w:top w:w="80" w:type="dxa"/>
+              <w:start w:w="120" w:type="dxa"/>
+              <w:bottom w:w="80" w:type="dxa"/>
+              <w:end w:w="120" w:type="dxa"/>
+            </w:tcMar>
+            <w:tcBorders>
+              <w:top w:val="single" w:sz="4" w:color="D7DDE0"/>
+              <w:left w:val="single" w:sz="4" w:color="D7DDE0"/>
+              <w:bottom w:val="single" w:sz="4" w:color="D7DDE0"/>
+              <w:right w:val="single" w:sz="4" w:color="D7DDE0"/>
+            </w:tcBorders>
+          </w:tcPr>
+          <w:p>
+            <w:r>
+              <w:rPr>
+                <w:b/>
+                <w:color w:val="FFFFFF"/>
+              </w:rPr>
+              <w:t>Layer</w:t>
+            </w:r>
+          </w:p>
+        </w:tc>
+        <w:tc>
+          <w:tcPr>
+            <w:tcW w:type="dxa" w:w="3360"/>
+            <w:shd w:fill="1C75BC"/>
+            <w:tcMar>
+              <w:top w:w="80" w:type="dxa"/>
+              <w:start w:w="120" w:type="dxa"/>
+              <w:bottom w:w="80" w:type="dxa"/>
+              <w:end w:w="120" w:type="dxa"/>
+            </w:tcMar>
+            <w:tcBorders>
+              <w:top w:val="single" w:sz="4" w:color="D7DDE0"/>
+              <w:left w:val="single" w:sz="4" w:color="D7DDE0"/>
+              <w:bottom w:val="single" w:sz="4" w:color="D7DDE0"/>
+              <w:right w:val="single" w:sz="4" w:color="D7DDE0"/>
+            </w:tcBorders>
+          </w:tcPr>
+          <w:p>
+            <w:r>
+              <w:rPr>
+                <w:b/>
+                <w:color w:val="FFFFFF"/>
+              </w:rPr>
+              <w:t>Current Handling</w:t>
+            </w:r>
+          </w:p>
+        </w:tc>
+        <w:tc>
+          <w:tcPr>
+            <w:tcW w:type="dxa" w:w="3360"/>
+            <w:shd w:fill="1C75BC"/>
+            <w:tcMar>
+              <w:top w:w="80" w:type="dxa"/>
+              <w:start w:w="120" w:type="dxa"/>
+              <w:bottom w:w="80" w:type="dxa"/>
+              <w:end w:w="120" w:type="dxa"/>
+            </w:tcMar>
+            <w:tcBorders>
+              <w:top w:val="single" w:sz="4" w:color="D7DDE0"/>
+              <w:left w:val="single" w:sz="4" w:color="D7DDE0"/>
+              <w:bottom w:val="single" w:sz="4" w:color="D7DDE0"/>
+              <w:right w:val="single" w:sz="4" w:color="D7DDE0"/>
+            </w:tcBorders>
+          </w:tcPr>
+          <w:p>
+            <w:r>
+              <w:rPr>
+                <w:b/>
+                <w:color w:val="FFFFFF"/>
+              </w:rPr>
+              <w:t>Protection / Caveat</w:t>
+            </w:r>
+          </w:p>
+        </w:tc>
+      </w:tr>
+      <w:tr>
+        <w:tc>
+          <w:tcPr>
+            <w:tcW w:type="dxa" w:w="3360"/>
+            <w:vAlign w:val="center"/>
+            <w:shd w:fill="F3F4F6"/>
+            <w:tcMar>
+              <w:top w:w="80" w:type="dxa"/>
+              <w:start w:w="120" w:type="dxa"/>
+              <w:bottom w:w="80" w:type="dxa"/>
+              <w:end w:w="120" w:type="dxa"/>
+            </w:tcMar>
+            <w:tcBorders>
+              <w:top w:val="single" w:sz="4" w:color="D7DDE0"/>
+              <w:left w:val="single" w:sz="4" w:color="D7DDE0"/>
+              <w:bottom w:val="single" w:sz="4" w:color="D7DDE0"/>
+              <w:right w:val="single" w:sz="4" w:color="D7DDE0"/>
+            </w:tcBorders>
+          </w:tcPr>
+          <w:p>
+            <w:r>
+              <w:rPr>
+                <w:rFonts w:ascii="Calibri" w:hAnsi="Calibri"/>
+                <w:b/>
+                <w:color w:val="1F2937"/>
+                <w:sz w:val="19"/>
+              </w:rPr>
+              <w:t>Desktop app</w:t>
+            </w:r>
+          </w:p>
+        </w:tc>
+        <w:tc>
+          <w:tcPr>
+            <w:tcW w:type="dxa" w:w="3360"/>
+            <w:vAlign w:val="center"/>
+            <w:shd w:fill="FFFFFF"/>
+            <w:tcMar>
+              <w:top w:w="80" w:type="dxa"/>
+              <w:start w:w="120" w:type="dxa"/>
+              <w:bottom w:w="80" w:type="dxa"/>
+              <w:end w:w="120" w:type="dxa"/>
+            </w:tcMar>
+            <w:tcBorders>
+              <w:top w:val="single" w:sz="4" w:color="D7DDE0"/>
+              <w:left w:val="single" w:sz="4" w:color="D7DDE0"/>
+              <w:bottom w:val="single" w:sz="4" w:color="D7DDE0"/>
+              <w:right w:val="single" w:sz="4" w:color="D7DDE0"/>
+            </w:tcBorders>
+          </w:tcPr>
+          <w:p>
+            <w:r>
+              <w:rPr>
+                <w:rFonts w:ascii="Calibri" w:hAnsi="Calibri"/>
+                <w:color w:val="1F2937"/>
+                <w:sz w:val="19"/>
+              </w:rPr>
+              <w:t>Runs locally in Docker on the user's workstation.</w:t>
+            </w:r>
+          </w:p>
+        </w:tc>
+        <w:tc>
+          <w:tcPr>
+            <w:tcW w:type="dxa" w:w="3360"/>
+            <w:vAlign w:val="center"/>
+            <w:shd w:fill="FFFFFF"/>
+            <w:tcMar>
+              <w:top w:w="80" w:type="dxa"/>
+              <w:start w:w="120" w:type="dxa"/>
+              <w:bottom w:w="80" w:type="dxa"/>
+              <w:end w:w="120" w:type="dxa"/>
+            </w:tcMar>
+            <w:tcBorders>
+              <w:top w:val="single" w:sz="4" w:color="D7DDE0"/>
+              <w:left w:val="single" w:sz="4" w:color="D7DDE0"/>
+              <w:bottom w:val="single" w:sz="4" w:color="D7DDE0"/>
+              <w:right w:val="single" w:sz="4" w:color="D7DDE0"/>
+            </w:tcBorders>
+          </w:tcPr>
+          <w:p>
+            <w:r>
+              <w:rPr>
+                <w:rFonts w:ascii="Calibri" w:hAnsi="Calibri"/>
+                <w:color w:val="1F2937"/>
+                <w:sz w:val="19"/>
+              </w:rPr>
+              <w:t>No provider key is stored on the workstation. The app authenticates the user with Microsoft Entra MSAL + PKCE.</w:t>
+            </w:r>
+          </w:p>
+        </w:tc>
+      </w:tr>
+      <w:tr>
+        <w:tc>
+          <w:tcPr>
+            <w:tcW w:type="dxa" w:w="3360"/>
+            <w:vAlign w:val="center"/>
+            <w:shd w:fill="F3F4F6"/>
+            <w:tcMar>
+              <w:top w:w="80" w:type="dxa"/>
+              <w:start w:w="120" w:type="dxa"/>
+              <w:bottom w:w="80" w:type="dxa"/>
+              <w:end w:w="120" w:type="dxa"/>
+            </w:tcMar>
+            <w:tcBorders>
+              <w:top w:val="single" w:sz="4" w:color="D7DDE0"/>
+              <w:left w:val="single" w:sz="4" w:color="D7DDE0"/>
+              <w:bottom w:val="single" w:sz="4" w:color="D7DDE0"/>
+              <w:right w:val="single" w:sz="4" w:color="D7DDE0"/>
+            </w:tcBorders>
+          </w:tcPr>
+          <w:p>
+            <w:r>
+              <w:rPr>
+                <w:rFonts w:ascii="Calibri" w:hAnsi="Calibri"/>
+                <w:b/>
+                <w:color w:val="1F2937"/>
+                <w:sz w:val="19"/>
+              </w:rPr>
+              <w:t>Local processing</w:t>
+            </w:r>
+          </w:p>
+        </w:tc>
+        <w:tc>
+          <w:tcPr>
+            <w:tcW w:type="dxa" w:w="3360"/>
+            <w:vAlign w:val="center"/>
+            <w:shd w:fill="FFFFFF"/>
+            <w:tcMar>
+              <w:top w:w="80" w:type="dxa"/>
+              <w:start w:w="120" w:type="dxa"/>
+              <w:bottom w:w="80" w:type="dxa"/>
+              <w:end w:w="120" w:type="dxa"/>
+            </w:tcMar>
+            <w:tcBorders>
+              <w:top w:val="single" w:sz="4" w:color="D7DDE0"/>
+              <w:left w:val="single" w:sz="4" w:color="D7DDE0"/>
+              <w:bottom w:val="single" w:sz="4" w:color="D7DDE0"/>
+              <w:right w:val="single" w:sz="4" w:color="D7DDE0"/>
+            </w:tcBorders>
+          </w:tcPr>
+          <w:p>
+            <w:r>
+              <w:rPr>
+                <w:rFonts w:ascii="Calibri" w:hAnsi="Calibri"/>
+                <w:color w:val="1F2937"/>
+                <w:sz w:val="19"/>
+              </w:rPr>
+              <w:t>FFmpeg, Whisper, OCR, frame scoring, frame review, DOCX build, and QA run locally.</w:t>
+            </w:r>
+          </w:p>
+        </w:tc>
+        <w:tc>
+          <w:tcPr>
+            <w:tcW w:type="dxa" w:w="3360"/>
+            <w:vAlign w:val="center"/>
+            <w:shd w:fill="FFFFFF"/>
+            <w:tcMar>
+              <w:top w:w="80" w:type="dxa"/>
+              <w:start w:w="120" w:type="dxa"/>
+              <w:bottom w:w="80" w:type="dxa"/>
+              <w:end w:w="120" w:type="dxa"/>
+            </w:tcMar>
+            <w:tcBorders>
+              <w:top w:val="single" w:sz="4" w:color="D7DDE0"/>
+              <w:left w:val="single" w:sz="4" w:color="D7DDE0"/>
+              <w:bottom w:val="single" w:sz="4" w:color="D7DDE0"/>
+              <w:right w:val="single" w:sz="4" w:color="D7DDE0"/>
+            </w:tcBorders>
+          </w:tcPr>
+          <w:p>
+            <w:r>
+              <w:rPr>
+                <w:rFonts w:ascii="Calibri" w:hAnsi="Calibri"/>
+                <w:color w:val="1F2937"/>
+                <w:sz w:val="19"/>
+              </w:rPr>
+              <w:t>Large media and guide artifacts stay in mapped local folders.</w:t>
+            </w:r>
+          </w:p>
+        </w:tc>
+      </w:tr>
+      <w:tr>
+        <w:tc>
+          <w:tcPr>
+            <w:tcW w:type="dxa" w:w="3360"/>
+            <w:vAlign w:val="center"/>
+            <w:shd w:fill="F3F4F6"/>
+            <w:tcMar>
+              <w:top w:w="80" w:type="dxa"/>
+              <w:start w:w="120" w:type="dxa"/>
+              <w:bottom w:w="80" w:type="dxa"/>
+              <w:end w:w="120" w:type="dxa"/>
+            </w:tcMar>
+            <w:tcBorders>
+              <w:top w:val="single" w:sz="4" w:color="D7DDE0"/>
+              <w:left w:val="single" w:sz="4" w:color="D7DDE0"/>
+              <w:bottom w:val="single" w:sz="4" w:color="D7DDE0"/>
+              <w:right w:val="single" w:sz="4" w:color="D7DDE0"/>
+            </w:tcBorders>
+          </w:tcPr>
+          <w:p>
+            <w:r>
+              <w:rPr>
+                <w:rFonts w:ascii="Calibri" w:hAnsi="Calibri"/>
+                <w:b/>
+                <w:color w:val="1F2937"/>
+                <w:sz w:val="19"/>
+              </w:rPr>
+              <w:t>Prompt payload</w:t>
+            </w:r>
+          </w:p>
+        </w:tc>
+        <w:tc>
+          <w:tcPr>
+            <w:tcW w:type="dxa" w:w="3360"/>
+            <w:vAlign w:val="center"/>
+            <w:shd w:fill="FFFFFF"/>
+            <w:tcMar>
+              <w:top w:w="80" w:type="dxa"/>
+              <w:start w:w="120" w:type="dxa"/>
+              <w:bottom w:w="80" w:type="dxa"/>
+              <w:end w:w="120" w:type="dxa"/>
+            </w:tcMar>
+            <w:tcBorders>
+              <w:top w:val="single" w:sz="4" w:color="D7DDE0"/>
+              <w:left w:val="single" w:sz="4" w:color="D7DDE0"/>
+              <w:bottom w:val="single" w:sz="4" w:color="D7DDE0"/>
+              <w:right w:val="single" w:sz="4" w:color="D7DDE0"/>
+            </w:tcBorders>
+          </w:tcPr>
+          <w:p>
+            <w:r>
+              <w:rPr>
+                <w:rFonts w:ascii="Calibri" w:hAnsi="Calibri"/>
+                <w:color w:val="1F2937"/>
+                <w:sz w:val="19"/>
+              </w:rPr>
+              <w:t>Only compact reviewed context is sent for generation.</w:t>
+            </w:r>
+          </w:p>
+        </w:tc>
+        <w:tc>
+          <w:tcPr>
+            <w:tcW w:type="dxa" w:w="3360"/>
+            <w:vAlign w:val="center"/>
+            <w:shd w:fill="FFFFFF"/>
+            <w:tcMar>
+              <w:top w:w="80" w:type="dxa"/>
+              <w:start w:w="120" w:type="dxa"/>
+              <w:bottom w:w="80" w:type="dxa"/>
+              <w:end w:w="120" w:type="dxa"/>
+            </w:tcMar>
+            <w:tcBorders>
+              <w:top w:val="single" w:sz="4" w:color="D7DDE0"/>
+              <w:left w:val="single" w:sz="4" w:color="D7DDE0"/>
+              <w:bottom w:val="single" w:sz="4" w:color="D7DDE0"/>
+              <w:right w:val="single" w:sz="4" w:color="D7DDE0"/>
+            </w:tcBorders>
+          </w:tcPr>
+          <w:p>
+            <w:r>
+              <w:rPr>
+                <w:rFonts w:ascii="Calibri" w:hAnsi="Calibri"/>
+                <w:color w:val="1F2937"/>
+                <w:sz w:val="19"/>
+              </w:rPr>
+              <w:t>Prompt data can still contain PHI/PII if the recording, OCR, transcript, or reviewer notes contain it.</w:t>
+            </w:r>
+          </w:p>
+        </w:tc>
+      </w:tr>
+      <w:tr>
+        <w:tc>
+          <w:tcPr>
+            <w:tcW w:type="dxa" w:w="3360"/>
+            <w:vAlign w:val="center"/>
+            <w:shd w:fill="F3F4F6"/>
+            <w:tcMar>
+              <w:top w:w="80" w:type="dxa"/>
+              <w:start w:w="120" w:type="dxa"/>
+              <w:bottom w:w="80" w:type="dxa"/>
+              <w:end w:w="120" w:type="dxa"/>
+            </w:tcMar>
+            <w:tcBorders>
+              <w:top w:val="single" w:sz="4" w:color="D7DDE0"/>
+              <w:left w:val="single" w:sz="4" w:color="D7DDE0"/>
+              <w:bottom w:val="single" w:sz="4" w:color="D7DDE0"/>
+              <w:right w:val="single" w:sz="4" w:color="D7DDE0"/>
+            </w:tcBorders>
+          </w:tcPr>
+          <w:p>
+            <w:r>
+              <w:rPr>
+                <w:rFonts w:ascii="Calibri" w:hAnsi="Calibri"/>
+                <w:b/>
+                <w:color w:val="1F2937"/>
+                <w:sz w:val="19"/>
+              </w:rPr>
+              <w:t>Azure Function</w:t>
+            </w:r>
+          </w:p>
+        </w:tc>
+        <w:tc>
+          <w:tcPr>
+            <w:tcW w:type="dxa" w:w="3360"/>
+            <w:vAlign w:val="center"/>
+            <w:shd w:fill="FFFFFF"/>
+            <w:tcMar>
+              <w:top w:w="80" w:type="dxa"/>
+              <w:start w:w="120" w:type="dxa"/>
+              <w:bottom w:w="80" w:type="dxa"/>
+              <w:end w:w="120" w:type="dxa"/>
+            </w:tcMar>
+            <w:tcBorders>
+              <w:top w:val="single" w:sz="4" w:color="D7DDE0"/>
+              <w:left w:val="single" w:sz="4" w:color="D7DDE0"/>
+              <w:bottom w:val="single" w:sz="4" w:color="D7DDE0"/>
+              <w:right w:val="single" w:sz="4" w:color="D7DDE0"/>
+            </w:tcBorders>
+          </w:tcPr>
+          <w:p>
+            <w:r>
+              <w:rPr>
+                <w:rFonts w:ascii="Calibri" w:hAnsi="Calibri"/>
+                <w:color w:val="1F2937"/>
+                <w:sz w:val="19"/>
+              </w:rPr>
+              <w:t>Acts as the server-side policy boundary.</w:t>
+            </w:r>
+          </w:p>
+        </w:tc>
+        <w:tc>
+          <w:tcPr>
+            <w:tcW w:type="dxa" w:w="3360"/>
+            <w:vAlign w:val="center"/>
+            <w:shd w:fill="FFFFFF"/>
+            <w:tcMar>
+              <w:top w:w="80" w:type="dxa"/>
+              <w:start w:w="120" w:type="dxa"/>
+              <w:bottom w:w="80" w:type="dxa"/>
+              <w:end w:w="120" w:type="dxa"/>
+            </w:tcMar>
+            <w:tcBorders>
+              <w:top w:val="single" w:sz="4" w:color="D7DDE0"/>
+              <w:left w:val="single" w:sz="4" w:color="D7DDE0"/>
+              <w:bottom w:val="single" w:sz="4" w:color="D7DDE0"/>
+              <w:right w:val="single" w:sz="4" w:color="D7DDE0"/>
+            </w:tcBorders>
+          </w:tcPr>
+          <w:p>
+            <w:r>
+              <w:rPr>
+                <w:rFonts w:ascii="Calibri" w:hAnsi="Calibri"/>
+                <w:color w:val="1F2937"/>
+                <w:sz w:val="19"/>
+              </w:rPr>
+              <w:t>Validates user tokens, queues generation, enforces token scheduling, calls Foundry, and records usage/failure details.</w:t>
+            </w:r>
+          </w:p>
+        </w:tc>
+      </w:tr>
+      <w:tr>
+        <w:tc>
+          <w:tcPr>
+            <w:tcW w:type="dxa" w:w="3360"/>
+            <w:vAlign w:val="center"/>
+            <w:shd w:fill="F3F4F6"/>
+            <w:tcMar>
+              <w:top w:w="80" w:type="dxa"/>
+              <w:start w:w="120" w:type="dxa"/>
+              <w:bottom w:w="80" w:type="dxa"/>
+              <w:end w:w="120" w:type="dxa"/>
+            </w:tcMar>
+            <w:tcBorders>
+              <w:top w:val="single" w:sz="4" w:color="D7DDE0"/>
+              <w:left w:val="single" w:sz="4" w:color="D7DDE0"/>
+              <w:bottom w:val="single" w:sz="4" w:color="D7DDE0"/>
+              <w:right w:val="single" w:sz="4" w:color="D7DDE0"/>
+            </w:tcBorders>
+          </w:tcPr>
+          <w:p>
+            <w:r>
+              <w:rPr>
+                <w:rFonts w:ascii="Calibri" w:hAnsi="Calibri"/>
+                <w:b/>
+                <w:color w:val="1F2937"/>
+                <w:sz w:val="19"/>
+              </w:rPr>
+              <w:t>Azure Foundry Claude</w:t>
+            </w:r>
+          </w:p>
+        </w:tc>
+        <w:tc>
+          <w:tcPr>
+            <w:tcW w:type="dxa" w:w="3360"/>
+            <w:vAlign w:val="center"/>
+            <w:shd w:fill="FFFFFF"/>
+            <w:tcMar>
+              <w:top w:w="80" w:type="dxa"/>
+              <w:start w:w="120" w:type="dxa"/>
+              <w:bottom w:w="80" w:type="dxa"/>
+              <w:end w:w="120" w:type="dxa"/>
+            </w:tcMar>
+            <w:tcBorders>
+              <w:top w:val="single" w:sz="4" w:color="D7DDE0"/>
+              <w:left w:val="single" w:sz="4" w:color="D7DDE0"/>
+              <w:bottom w:val="single" w:sz="4" w:color="D7DDE0"/>
+              <w:right w:val="single" w:sz="4" w:color="D7DDE0"/>
+            </w:tcBorders>
+          </w:tcPr>
+          <w:p>
+            <w:r>
+              <w:rPr>
+                <w:rFonts w:ascii="Calibri" w:hAnsi="Calibri"/>
+                <w:color w:val="1F2937"/>
+                <w:sz w:val="19"/>
+              </w:rPr>
+              <w:t>Uses Claude Sonnet 4.6 through the Foundry Marketplace deployment.</w:t>
+            </w:r>
+          </w:p>
+        </w:tc>
+        <w:tc>
+          <w:tcPr>
+            <w:tcW w:type="dxa" w:w="3360"/>
+            <w:vAlign w:val="center"/>
+            <w:shd w:fill="FFFFFF"/>
+            <w:tcMar>
+              <w:top w:w="80" w:type="dxa"/>
+              <w:start w:w="120" w:type="dxa"/>
+              <w:bottom w:w="80" w:type="dxa"/>
+              <w:end w:w="120" w:type="dxa"/>
+            </w:tcMar>
+            <w:tcBorders>
+              <w:top w:val="single" w:sz="4" w:color="D7DDE0"/>
+              <w:left w:val="single" w:sz="4" w:color="D7DDE0"/>
+              <w:bottom w:val="single" w:sz="4" w:color="D7DDE0"/>
+              <w:right w:val="single" w:sz="4" w:color="D7DDE0"/>
+            </w:tcBorders>
+          </w:tcPr>
+          <w:p>
+            <w:r>
+              <w:rPr>
+                <w:rFonts w:ascii="Calibri" w:hAnsi="Calibri"/>
+                <w:color w:val="1F2937"/>
+                <w:sz w:val="19"/>
+              </w:rPr>
+              <w:t>Anthropic processes prompts and outputs for the Claude API; Microsoft manages deployment infrastructure and usage/billing processing.</w:t>
+            </w:r>
+          </w:p>
+        </w:tc>
+      </w:tr>
+      <w:tr>
+        <w:tc>
+          <w:tcPr>
+            <w:tcW w:type="dxa" w:w="3360"/>
+            <w:vAlign w:val="center"/>
+            <w:shd w:fill="F3F4F6"/>
+            <w:tcMar>
+              <w:top w:w="80" w:type="dxa"/>
+              <w:start w:w="120" w:type="dxa"/>
+              <w:bottom w:w="80" w:type="dxa"/>
+              <w:end w:w="120" w:type="dxa"/>
+            </w:tcMar>
+            <w:tcBorders>
+              <w:top w:val="single" w:sz="4" w:color="D7DDE0"/>
+              <w:left w:val="single" w:sz="4" w:color="D7DDE0"/>
+              <w:bottom w:val="single" w:sz="4" w:color="D7DDE0"/>
+              <w:right w:val="single" w:sz="4" w:color="D7DDE0"/>
+            </w:tcBorders>
+          </w:tcPr>
+          <w:p>
+            <w:r>
+              <w:rPr>
+                <w:rFonts w:ascii="Calibri" w:hAnsi="Calibri"/>
+                <w:b/>
+                <w:color w:val="1F2937"/>
+                <w:sz w:val="19"/>
+              </w:rPr>
+              <w:t>Cosmos DB AI Spend</w:t>
+            </w:r>
+          </w:p>
+        </w:tc>
+        <w:tc>
+          <w:tcPr>
+            <w:tcW w:type="dxa" w:w="3360"/>
+            <w:vAlign w:val="center"/>
+            <w:shd w:fill="FFFFFF"/>
+            <w:tcMar>
+              <w:top w:w="80" w:type="dxa"/>
+              <w:start w:w="120" w:type="dxa"/>
+              <w:bottom w:w="80" w:type="dxa"/>
+              <w:end w:w="120" w:type="dxa"/>
+            </w:tcMar>
+            <w:tcBorders>
+              <w:top w:val="single" w:sz="4" w:color="D7DDE0"/>
+              <w:left w:val="single" w:sz="4" w:color="D7DDE0"/>
+              <w:bottom w:val="single" w:sz="4" w:color="D7DDE0"/>
+              <w:right w:val="single" w:sz="4" w:color="D7DDE0"/>
+            </w:tcBorders>
+          </w:tcPr>
+          <w:p>
+            <w:r>
+              <w:rPr>
+                <w:rFonts w:ascii="Calibri" w:hAnsi="Calibri"/>
+                <w:color w:val="1F2937"/>
+                <w:sz w:val="19"/>
+              </w:rPr>
+              <w:t>Stores usage, document, owner, page count, cost estimate, status, and failure metadata.</w:t>
+            </w:r>
+          </w:p>
+        </w:tc>
+        <w:tc>
+          <w:tcPr>
+            <w:tcW w:type="dxa" w:w="3360"/>
+            <w:vAlign w:val="center"/>
+            <w:shd w:fill="FFFFFF"/>
+            <w:tcMar>
+              <w:top w:w="80" w:type="dxa"/>
+              <w:start w:w="120" w:type="dxa"/>
+              <w:bottom w:w="80" w:type="dxa"/>
+              <w:end w:w="120" w:type="dxa"/>
+            </w:tcMar>
+            <w:tcBorders>
+              <w:top w:val="single" w:sz="4" w:color="D7DDE0"/>
+              <w:left w:val="single" w:sz="4" w:color="D7DDE0"/>
+              <w:bottom w:val="single" w:sz="4" w:color="D7DDE0"/>
+              <w:right w:val="single" w:sz="4" w:color="D7DDE0"/>
+            </w:tcBorders>
+          </w:tcPr>
+          <w:p>
+            <w:r>
+              <w:rPr>
+                <w:rFonts w:ascii="Calibri" w:hAnsi="Calibri"/>
+                <w:color w:val="1F2937"/>
+                <w:sz w:val="19"/>
+              </w:rPr>
+              <w:t>Usage records must avoid PHI in titles, session names, failure reasons, or free-text metadata.</w:t>
+            </w:r>
+          </w:p>
+        </w:tc>
+      </w:tr>
+    </w:tbl>
+    <w:p/>
+    <w:p>
+      <w:pPr>
+        <w:pStyle w:val="Heading1"/>
+      </w:pPr>
+      <w:r>
+        <w:t>Data Flow Risk Considerations</w:t>
       </w:r>
     </w:p>
     <w:tbl>
@@ -1582,7 +2325,7 @@
                 <w:color w:val="1F2937"/>
                 <w:sz w:val="19"/>
               </w:rPr>
-              <w:t>Lowest vendor exposure if raw video is never sent to Anthropic.</w:t>
+              <w:t>Lowest vendor exposure if raw video is never sent to the Azure Function or model provider.</w:t>
             </w:r>
           </w:p>
         </w:tc>
@@ -1643,7 +2386,7 @@
                 <w:color w:val="1F2937"/>
                 <w:sz w:val="19"/>
               </w:rPr>
-              <w:t>Used to create compact guide context.</w:t>
+              <w:t>Generated locally with Whisper or imported as a sidecar and summarized into prompt context.</w:t>
             </w:r>
           </w:p>
         </w:tc>
@@ -1672,7 +2415,7 @@
                 <w:color w:val="1F2937"/>
                 <w:sz w:val="19"/>
               </w:rPr>
-              <w:t>Can contain PHI/PII if a recording includes patient names, prescription details, identifiers, or support context.</w:t>
+              <w:t>Can contain PHI/PII if narration includes patient, prescription, account, or support details.</w:t>
             </w:r>
           </w:p>
         </w:tc>
@@ -1733,7 +2476,7 @@
                 <w:color w:val="1F2937"/>
                 <w:sz w:val="19"/>
               </w:rPr>
-              <w:t>Extracted locally and summarized into the trace.</w:t>
+              <w:t>Extracted locally and used as visible UI evidence.</w:t>
             </w:r>
           </w:p>
         </w:tc>
@@ -1762,7 +2505,7 @@
                 <w:color w:val="1F2937"/>
                 <w:sz w:val="19"/>
               </w:rPr>
-              <w:t>Can expose patient, pharmacy, employee, account, or workflow-sensitive details.</w:t>
+              <w:t>Can expose patient, pharmacy, employee, account, or workflow-sensitive details shown on screen.</w:t>
             </w:r>
           </w:p>
         </w:tc>
@@ -1823,7 +2566,7 @@
                 <w:color w:val="1F2937"/>
                 <w:sz w:val="19"/>
               </w:rPr>
-              <w:t>Used to steer guide generation.</w:t>
+              <w:t>Used to steer guide generation and explain uncertainty.</w:t>
             </w:r>
           </w:p>
         </w:tc>
@@ -1852,7 +2595,7 @@
                 <w:color w:val="1F2937"/>
                 <w:sz w:val="19"/>
               </w:rPr>
-              <w:t>Can introduce PHI/PII if reviewers type identifiers or case details.</w:t>
+              <w:t>Can introduce PHI/PII if reviewers type identifiers, case details, or customer-specific context.</w:t>
             </w:r>
           </w:p>
         </w:tc>
@@ -1913,7 +2656,7 @@
                 <w:color w:val="1F2937"/>
                 <w:sz w:val="19"/>
               </w:rPr>
-              <w:t>May be included or represented in the guide-generation context.</w:t>
+              <w:t>Selected locally for guide context and final DOCX output.</w:t>
             </w:r>
           </w:p>
         </w:tc>
@@ -1942,7 +2685,97 @@
                 <w:color w:val="1F2937"/>
                 <w:sz w:val="19"/>
               </w:rPr>
-              <w:t>Image content can include PHI/PII if screens are not masked or reviewed.</w:t>
+              <w:t>Image content can include PHI/PII if screens are not masked, de-identified, or reviewed.</w:t>
+            </w:r>
+          </w:p>
+        </w:tc>
+      </w:tr>
+      <w:tr>
+        <w:tc>
+          <w:tcPr>
+            <w:tcW w:type="dxa" w:w="3360"/>
+            <w:vAlign w:val="center"/>
+            <w:shd w:fill="F3F4F6"/>
+            <w:tcMar>
+              <w:top w:w="80" w:type="dxa"/>
+              <w:start w:w="120" w:type="dxa"/>
+              <w:bottom w:w="80" w:type="dxa"/>
+              <w:end w:w="120" w:type="dxa"/>
+            </w:tcMar>
+            <w:tcBorders>
+              <w:top w:val="single" w:sz="4" w:color="D7DDE0"/>
+              <w:left w:val="single" w:sz="4" w:color="D7DDE0"/>
+              <w:bottom w:val="single" w:sz="4" w:color="D7DDE0"/>
+              <w:right w:val="single" w:sz="4" w:color="D7DDE0"/>
+            </w:tcBorders>
+          </w:tcPr>
+          <w:p>
+            <w:r>
+              <w:rPr>
+                <w:rFonts w:ascii="Calibri" w:hAnsi="Calibri"/>
+                <w:b/>
+                <w:color w:val="1F2937"/>
+                <w:sz w:val="19"/>
+              </w:rPr>
+              <w:t>Prompt payload</w:t>
+            </w:r>
+          </w:p>
+        </w:tc>
+        <w:tc>
+          <w:tcPr>
+            <w:tcW w:type="dxa" w:w="3360"/>
+            <w:vAlign w:val="center"/>
+            <w:shd w:fill="FFFFFF"/>
+            <w:tcMar>
+              <w:top w:w="80" w:type="dxa"/>
+              <w:start w:w="120" w:type="dxa"/>
+              <w:bottom w:w="80" w:type="dxa"/>
+              <w:end w:w="120" w:type="dxa"/>
+            </w:tcMar>
+            <w:tcBorders>
+              <w:top w:val="single" w:sz="4" w:color="D7DDE0"/>
+              <w:left w:val="single" w:sz="4" w:color="D7DDE0"/>
+              <w:bottom w:val="single" w:sz="4" w:color="D7DDE0"/>
+              <w:right w:val="single" w:sz="4" w:color="D7DDE0"/>
+            </w:tcBorders>
+          </w:tcPr>
+          <w:p>
+            <w:r>
+              <w:rPr>
+                <w:rFonts w:ascii="Calibri" w:hAnsi="Calibri"/>
+                <w:color w:val="1F2937"/>
+                <w:sz w:val="19"/>
+              </w:rPr>
+              <w:t>Sent to the Azure Function and then to Azure Foundry Claude.</w:t>
+            </w:r>
+          </w:p>
+        </w:tc>
+        <w:tc>
+          <w:tcPr>
+            <w:tcW w:type="dxa" w:w="3360"/>
+            <w:vAlign w:val="center"/>
+            <w:shd w:fill="FFFFFF"/>
+            <w:tcMar>
+              <w:top w:w="80" w:type="dxa"/>
+              <w:start w:w="120" w:type="dxa"/>
+              <w:bottom w:w="80" w:type="dxa"/>
+              <w:end w:w="120" w:type="dxa"/>
+            </w:tcMar>
+            <w:tcBorders>
+              <w:top w:val="single" w:sz="4" w:color="D7DDE0"/>
+              <w:left w:val="single" w:sz="4" w:color="D7DDE0"/>
+              <w:bottom w:val="single" w:sz="4" w:color="D7DDE0"/>
+              <w:right w:val="single" w:sz="4" w:color="D7DDE0"/>
+            </w:tcBorders>
+          </w:tcPr>
+          <w:p>
+            <w:r>
+              <w:rPr>
+                <w:rFonts w:ascii="Calibri" w:hAnsi="Calibri"/>
+                <w:color w:val="1F2937"/>
+                <w:sz w:val="19"/>
+              </w:rPr>
+              <w:t>Primary cloud data exposure point; must be minimized and governed.</w:t>
             </w:r>
           </w:p>
         </w:tc>
@@ -2003,7 +2836,7 @@
                 <w:color w:val="1F2937"/>
                 <w:sz w:val="19"/>
               </w:rPr>
-              <w:t>Returned by Anthropic and stored locally.</w:t>
+              <w:t>Returned by Claude, built into a local DOCX, and optionally downloaded by the user.</w:t>
             </w:r>
           </w:p>
         </w:tc>
@@ -2032,7 +2865,97 @@
                 <w:color w:val="1F2937"/>
                 <w:sz w:val="19"/>
               </w:rPr>
-              <w:t>May restate sensitive content unless prompts and QA rules prevent it.</w:t>
+              <w:t>May restate sensitive content unless prompts, QA, and human review prevent it.</w:t>
+            </w:r>
+          </w:p>
+        </w:tc>
+      </w:tr>
+      <w:tr>
+        <w:tc>
+          <w:tcPr>
+            <w:tcW w:type="dxa" w:w="3360"/>
+            <w:vAlign w:val="center"/>
+            <w:shd w:fill="F3F4F6"/>
+            <w:tcMar>
+              <w:top w:w="80" w:type="dxa"/>
+              <w:start w:w="120" w:type="dxa"/>
+              <w:bottom w:w="80" w:type="dxa"/>
+              <w:end w:w="120" w:type="dxa"/>
+            </w:tcMar>
+            <w:tcBorders>
+              <w:top w:val="single" w:sz="4" w:color="D7DDE0"/>
+              <w:left w:val="single" w:sz="4" w:color="D7DDE0"/>
+              <w:bottom w:val="single" w:sz="4" w:color="D7DDE0"/>
+              <w:right w:val="single" w:sz="4" w:color="D7DDE0"/>
+            </w:tcBorders>
+          </w:tcPr>
+          <w:p>
+            <w:r>
+              <w:rPr>
+                <w:rFonts w:ascii="Calibri" w:hAnsi="Calibri"/>
+                <w:b/>
+                <w:color w:val="1F2937"/>
+                <w:sz w:val="19"/>
+              </w:rPr>
+              <w:t>Usage reporting</w:t>
+            </w:r>
+          </w:p>
+        </w:tc>
+        <w:tc>
+          <w:tcPr>
+            <w:tcW w:type="dxa" w:w="3360"/>
+            <w:vAlign w:val="center"/>
+            <w:shd w:fill="FFFFFF"/>
+            <w:tcMar>
+              <w:top w:w="80" w:type="dxa"/>
+              <w:start w:w="120" w:type="dxa"/>
+              <w:bottom w:w="80" w:type="dxa"/>
+              <w:end w:w="120" w:type="dxa"/>
+            </w:tcMar>
+            <w:tcBorders>
+              <w:top w:val="single" w:sz="4" w:color="D7DDE0"/>
+              <w:left w:val="single" w:sz="4" w:color="D7DDE0"/>
+              <w:bottom w:val="single" w:sz="4" w:color="D7DDE0"/>
+              <w:right w:val="single" w:sz="4" w:color="D7DDE0"/>
+            </w:tcBorders>
+          </w:tcPr>
+          <w:p>
+            <w:r>
+              <w:rPr>
+                <w:rFonts w:ascii="Calibri" w:hAnsi="Calibri"/>
+                <w:color w:val="1F2937"/>
+                <w:sz w:val="19"/>
+              </w:rPr>
+              <w:t>Stored in Cosmos DB for AI Spend visibility.</w:t>
+            </w:r>
+          </w:p>
+        </w:tc>
+        <w:tc>
+          <w:tcPr>
+            <w:tcW w:type="dxa" w:w="3360"/>
+            <w:vAlign w:val="center"/>
+            <w:shd w:fill="FFFFFF"/>
+            <w:tcMar>
+              <w:top w:w="80" w:type="dxa"/>
+              <w:start w:w="120" w:type="dxa"/>
+              <w:bottom w:w="80" w:type="dxa"/>
+              <w:end w:w="120" w:type="dxa"/>
+            </w:tcMar>
+            <w:tcBorders>
+              <w:top w:val="single" w:sz="4" w:color="D7DDE0"/>
+              <w:left w:val="single" w:sz="4" w:color="D7DDE0"/>
+              <w:bottom w:val="single" w:sz="4" w:color="D7DDE0"/>
+              <w:right w:val="single" w:sz="4" w:color="D7DDE0"/>
+            </w:tcBorders>
+          </w:tcPr>
+          <w:p>
+            <w:r>
+              <w:rPr>
+                <w:rFonts w:ascii="Calibri" w:hAnsi="Calibri"/>
+                <w:color w:val="1F2937"/>
+                <w:sz w:val="19"/>
+              </w:rPr>
+              <w:t>Should remain operational metadata only and should not include patient or customer identifiers.</w:t>
             </w:r>
           </w:p>
         </w:tc>
@@ -2044,7 +2967,7 @@
         <w:pStyle w:val="Heading1"/>
       </w:pPr>
       <w:r>
-        <w:t>Published Anthropic Protections Relevant To API Use</w:t>
+        <w:t>Published Protections And Caveats</w:t>
       </w:r>
     </w:p>
     <w:tbl>
@@ -2083,7 +3006,7 @@
                 <w:b/>
                 <w:color w:val="FFFFFF"/>
               </w:rPr>
-              <w:t>Protection</w:t>
+              <w:t>Topic</w:t>
             </w:r>
           </w:p>
         </w:tc>
@@ -2169,7 +3092,7 @@
                 <w:color w:val="1F2937"/>
                 <w:sz w:val="19"/>
               </w:rPr>
-              <w:t>Model training</w:t>
+              <w:t>Azure Foundry Claude data processing</w:t>
             </w:r>
           </w:p>
         </w:tc>
@@ -2198,7 +3121,7 @@
                 <w:color w:val="1F2937"/>
                 <w:sz w:val="19"/>
               </w:rPr>
-              <w:t>Anthropic's Commercial Terms state that Anthropic may not train models on customer content from Services.</w:t>
+              <w:t>Microsoft states that for Claude in Foundry, Anthropic acts as the data processor for prompts and outputs, while Microsoft manages the API deployment infrastructure.</w:t>
             </w:r>
           </w:p>
         </w:tc>
@@ -2227,7 +3150,7 @@
                 <w:color w:val="1F2937"/>
                 <w:sz w:val="19"/>
               </w:rPr>
-              <w:t>This supports use of the API for confidential documentation workflows, subject to contract and data-handling review.</w:t>
+              <w:t>Azure routing does not eliminate Anthropic data processing. Compliance review must consider both Microsoft and Anthropic terms.</w:t>
             </w:r>
           </w:p>
         </w:tc>
@@ -2259,7 +3182,7 @@
                 <w:color w:val="1F2937"/>
                 <w:sz w:val="19"/>
               </w:rPr>
-              <w:t>Customer ownership</w:t>
+              <w:t>Regional processing</w:t>
             </w:r>
           </w:p>
         </w:tc>
@@ -2288,7 +3211,7 @@
                 <w:color w:val="1F2937"/>
                 <w:sz w:val="19"/>
               </w:rPr>
-              <w:t>Customer retains inputs and owns outputs under the Commercial Terms, to the extent permitted by law.</w:t>
+              <w:t>Microsoft states that Claude prompts and outputs may be processed outside the selected region for operational purposes.</w:t>
             </w:r>
           </w:p>
         </w:tc>
@@ -2317,7 +3240,7 @@
                 <w:color w:val="1F2937"/>
                 <w:sz w:val="19"/>
               </w:rPr>
-              <w:t>Generated guides should remain keycentrix/customer-controlled deliverables.</w:t>
+              <w:t>Do not assume single-region processing for PHI-sensitive workflows without formal compliance approval.</w:t>
             </w:r>
           </w:p>
         </w:tc>
@@ -2349,7 +3272,7 @@
                 <w:color w:val="1F2937"/>
                 <w:sz w:val="19"/>
               </w:rPr>
-              <w:t>Standard retention</w:t>
+              <w:t>Marketplace transaction</w:t>
             </w:r>
           </w:p>
         </w:tc>
@@ -2378,7 +3301,7 @@
                 <w:color w:val="1F2937"/>
                 <w:sz w:val="19"/>
               </w:rPr>
-              <w:t>API inputs and outputs are deleted within 30 days by default, with stated exceptions.</w:t>
+              <w:t>Microsoft states that Marketplace contact, transaction, billing, and usage details may be shared with the model publisher.</w:t>
             </w:r>
           </w:p>
         </w:tc>
@@ -2407,7 +3330,7 @@
                 <w:color w:val="1F2937"/>
                 <w:sz w:val="19"/>
               </w:rPr>
-              <w:t>Default API use is not zero retention and should not be treated as sufficient for PHI without a covered arrangement.</w:t>
+              <w:t>Marketplace billing and publisher visibility must be reviewed before moving to a production subscription.</w:t>
             </w:r>
           </w:p>
         </w:tc>
@@ -2439,7 +3362,7 @@
                 <w:color w:val="1F2937"/>
                 <w:sz w:val="19"/>
               </w:rPr>
-              <w:t>Policy enforcement retention</w:t>
+              <w:t>Marketplace terms</w:t>
             </w:r>
           </w:p>
         </w:tc>
@@ -2468,7 +3391,7 @@
                 <w:color w:val="1F2937"/>
                 <w:sz w:val="19"/>
               </w:rPr>
-              <w:t>Flagged inputs and outputs may be retained longer for usage-policy enforcement; classifier scores may be retained longer.</w:t>
+              <w:t>Microsoft Product Terms state that Azure Marketplace products are subject to separate Marketplace terms.</w:t>
             </w:r>
           </w:p>
         </w:tc>
@@ -2497,7 +3420,7 @@
                 <w:color w:val="1F2937"/>
                 <w:sz w:val="19"/>
               </w:rPr>
-              <w:t>Sensitive data should be minimized even when using the standard API because exception paths exist.</w:t>
+              <w:t>Standard Azure credits or consumption commitments may not cover Claude Marketplace usage.</w:t>
             </w:r>
           </w:p>
         </w:tc>
@@ -2529,7 +3452,7 @@
                 <w:color w:val="1F2937"/>
                 <w:sz w:val="19"/>
               </w:rPr>
-              <w:t>Zero data retention</w:t>
+              <w:t>Anthropic retention and training</w:t>
             </w:r>
           </w:p>
         </w:tc>
@@ -2558,7 +3481,7 @@
                 <w:color w:val="1F2937"/>
                 <w:sz w:val="19"/>
               </w:rPr>
-              <w:t>Eligible enterprise API customers may have arrangements where inputs and outputs are not stored at rest after the response, except for law or misuse needs.</w:t>
+              <w:t>Anthropic documents API data-retention options, ZDR arrangements, and that retained API data is not used for model training without permission.</w:t>
             </w:r>
           </w:p>
         </w:tc>
@@ -2587,7 +3510,7 @@
                 <w:color w:val="1F2937"/>
                 <w:sz w:val="19"/>
               </w:rPr>
-              <w:t>ZDR is a strong control for regulated or sensitive workloads but requires Anthropic approval and contract confirmation.</w:t>
+              <w:t>This supports confidential use, but does not by itself approve PHI workflows.</w:t>
             </w:r>
           </w:p>
         </w:tc>
@@ -2619,7 +3542,7 @@
                 <w:color w:val="1F2937"/>
                 <w:sz w:val="19"/>
               </w:rPr>
-              <w:t>HIPAA-ready API</w:t>
+              <w:t>Anthropic HIPAA-ready API</w:t>
             </w:r>
           </w:p>
         </w:tc>
@@ -2648,7 +3571,7 @@
                 <w:color w:val="1F2937"/>
                 <w:sz w:val="19"/>
               </w:rPr>
-              <w:t>Anthropic supports HIPAA-ready API integrations with a signed BAA and a HIPAA-enabled organization.</w:t>
+              <w:t>Anthropic documents HIPAA-ready API access with a signed BAA and a HIPAA-enabled organization for eligible Claude API features.</w:t>
             </w:r>
           </w:p>
         </w:tc>
@@ -2677,112 +3600,7 @@
                 <w:color w:val="1F2937"/>
                 <w:sz w:val="19"/>
               </w:rPr>
-              <w:t>Production PHI use should be routed through the HIPAA-ready organization, not a general API organization.</w:t>
-            </w:r>
-          </w:p>
-        </w:tc>
-      </w:tr>
-    </w:tbl>
-    <w:p/>
-    <w:p>
-      <w:pPr>
-        <w:pStyle w:val="Heading1"/>
-      </w:pPr>
-      <w:r>
-        <w:t>BAA And HIPAA-Ready Requirements</w:t>
-      </w:r>
-    </w:p>
-    <w:tbl>
-      <w:tblPr>
-        <w:tblStyle w:val="TableGrid"/>
-        <w:tblW w:type="auto" w:w="0"/>
-        <w:jc w:val="center"/>
-        <w:tblLook w:firstColumn="1" w:firstRow="1" w:lastColumn="0" w:lastRow="0" w:noHBand="0" w:noVBand="1" w:val="04A0"/>
-      </w:tblPr>
-      <w:tblGrid>
-        <w:gridCol w:w="3360"/>
-        <w:gridCol w:w="3360"/>
-        <w:gridCol w:w="3360"/>
-      </w:tblGrid>
-      <w:tr>
-        <w:tc>
-          <w:tcPr>
-            <w:tcW w:type="dxa" w:w="3360"/>
-            <w:shd w:fill="1C75BC"/>
-            <w:tcMar>
-              <w:top w:w="80" w:type="dxa"/>
-              <w:start w:w="120" w:type="dxa"/>
-              <w:bottom w:w="80" w:type="dxa"/>
-              <w:end w:w="120" w:type="dxa"/>
-            </w:tcMar>
-            <w:tcBorders>
-              <w:top w:val="single" w:sz="4" w:color="D7DDE0"/>
-              <w:left w:val="single" w:sz="4" w:color="D7DDE0"/>
-              <w:bottom w:val="single" w:sz="4" w:color="D7DDE0"/>
-              <w:right w:val="single" w:sz="4" w:color="D7DDE0"/>
-            </w:tcBorders>
-          </w:tcPr>
-          <w:p>
-            <w:r>
-              <w:rPr>
-                <w:b/>
-                <w:color w:val="FFFFFF"/>
-              </w:rPr>
-              <w:t>Requirement</w:t>
-            </w:r>
-          </w:p>
-        </w:tc>
-        <w:tc>
-          <w:tcPr>
-            <w:tcW w:type="dxa" w:w="3360"/>
-            <w:shd w:fill="1C75BC"/>
-            <w:tcMar>
-              <w:top w:w="80" w:type="dxa"/>
-              <w:start w:w="120" w:type="dxa"/>
-              <w:bottom w:w="80" w:type="dxa"/>
-              <w:end w:w="120" w:type="dxa"/>
-            </w:tcMar>
-            <w:tcBorders>
-              <w:top w:val="single" w:sz="4" w:color="D7DDE0"/>
-              <w:left w:val="single" w:sz="4" w:color="D7DDE0"/>
-              <w:bottom w:val="single" w:sz="4" w:color="D7DDE0"/>
-              <w:right w:val="single" w:sz="4" w:color="D7DDE0"/>
-            </w:tcBorders>
-          </w:tcPr>
-          <w:p>
-            <w:r>
-              <w:rPr>
-                <w:b/>
-                <w:color w:val="FFFFFF"/>
-              </w:rPr>
-              <w:t>What Anthropic Publishes</w:t>
-            </w:r>
-          </w:p>
-        </w:tc>
-        <w:tc>
-          <w:tcPr>
-            <w:tcW w:type="dxa" w:w="3360"/>
-            <w:shd w:fill="1C75BC"/>
-            <w:tcMar>
-              <w:top w:w="80" w:type="dxa"/>
-              <w:start w:w="120" w:type="dxa"/>
-              <w:bottom w:w="80" w:type="dxa"/>
-              <w:end w:w="120" w:type="dxa"/>
-            </w:tcMar>
-            <w:tcBorders>
-              <w:top w:val="single" w:sz="4" w:color="D7DDE0"/>
-              <w:left w:val="single" w:sz="4" w:color="D7DDE0"/>
-              <w:bottom w:val="single" w:sz="4" w:color="D7DDE0"/>
-              <w:right w:val="single" w:sz="4" w:color="D7DDE0"/>
-            </w:tcBorders>
-          </w:tcPr>
-          <w:p>
-            <w:r>
-              <w:rPr>
-                <w:b/>
-                <w:color w:val="FFFFFF"/>
-              </w:rPr>
-              <w:t>KCXDocumentor Action</w:t>
+              <w:t>This is relevant but must be mapped carefully to the Foundry Marketplace path before PHI use is approved.</w:t>
             </w:r>
           </w:p>
         </w:tc>
@@ -2814,7 +3632,7 @@
                 <w:color w:val="1F2937"/>
                 <w:sz w:val="19"/>
               </w:rPr>
-              <w:t>Signed BAA</w:t>
+              <w:t>Unsupported features</w:t>
             </w:r>
           </w:p>
         </w:tc>
@@ -2843,7 +3661,7 @@
                 <w:color w:val="1F2937"/>
                 <w:sz w:val="19"/>
               </w:rPr>
-              <w:t>To use the first-party API with PHI, the organization administrator must sign a BAA and contact sales to enable it.</w:t>
+              <w:t>Anthropic documents that some API features are not ZDR or HIPAA eligible.</w:t>
             </w:r>
           </w:p>
         </w:tc>
@@ -2872,547 +3690,7 @@
                 <w:color w:val="1F2937"/>
                 <w:sz w:val="19"/>
               </w:rPr>
-              <w:t>Begin Anthropic sales/BAA process before allowing PHI-bearing recordings.</w:t>
-            </w:r>
-          </w:p>
-        </w:tc>
-      </w:tr>
-      <w:tr>
-        <w:tc>
-          <w:tcPr>
-            <w:tcW w:type="dxa" w:w="3360"/>
-            <w:vAlign w:val="center"/>
-            <w:shd w:fill="F3F4F6"/>
-            <w:tcMar>
-              <w:top w:w="80" w:type="dxa"/>
-              <w:start w:w="120" w:type="dxa"/>
-              <w:bottom w:w="80" w:type="dxa"/>
-              <w:end w:w="120" w:type="dxa"/>
-            </w:tcMar>
-            <w:tcBorders>
-              <w:top w:val="single" w:sz="4" w:color="D7DDE0"/>
-              <w:left w:val="single" w:sz="4" w:color="D7DDE0"/>
-              <w:bottom w:val="single" w:sz="4" w:color="D7DDE0"/>
-              <w:right w:val="single" w:sz="4" w:color="D7DDE0"/>
-            </w:tcBorders>
-          </w:tcPr>
-          <w:p>
-            <w:r>
-              <w:rPr>
-                <w:rFonts w:ascii="Calibri" w:hAnsi="Calibri"/>
-                <w:b/>
-                <w:color w:val="1F2937"/>
-                <w:sz w:val="19"/>
-              </w:rPr>
-              <w:t>HIPAA-enabled organization</w:t>
-            </w:r>
-          </w:p>
-        </w:tc>
-        <w:tc>
-          <w:tcPr>
-            <w:tcW w:type="dxa" w:w="3360"/>
-            <w:vAlign w:val="center"/>
-            <w:shd w:fill="FFFFFF"/>
-            <w:tcMar>
-              <w:top w:w="80" w:type="dxa"/>
-              <w:start w:w="120" w:type="dxa"/>
-              <w:bottom w:w="80" w:type="dxa"/>
-              <w:end w:w="120" w:type="dxa"/>
-            </w:tcMar>
-            <w:tcBorders>
-              <w:top w:val="single" w:sz="4" w:color="D7DDE0"/>
-              <w:left w:val="single" w:sz="4" w:color="D7DDE0"/>
-              <w:bottom w:val="single" w:sz="4" w:color="D7DDE0"/>
-              <w:right w:val="single" w:sz="4" w:color="D7DDE0"/>
-            </w:tcBorders>
-          </w:tcPr>
-          <w:p>
-            <w:r>
-              <w:rPr>
-                <w:rFonts w:ascii="Calibri" w:hAnsi="Calibri"/>
-                <w:color w:val="1F2937"/>
-                <w:sz w:val="19"/>
-              </w:rPr>
-              <w:t>Anthropic provisions a dedicated organization with HIPAA readiness controls and feature restrictions.</w:t>
-            </w:r>
-          </w:p>
-        </w:tc>
-        <w:tc>
-          <w:tcPr>
-            <w:tcW w:type="dxa" w:w="3360"/>
-            <w:vAlign w:val="center"/>
-            <w:shd w:fill="FFFFFF"/>
-            <w:tcMar>
-              <w:top w:w="80" w:type="dxa"/>
-              <w:start w:w="120" w:type="dxa"/>
-              <w:bottom w:w="80" w:type="dxa"/>
-              <w:end w:w="120" w:type="dxa"/>
-            </w:tcMar>
-            <w:tcBorders>
-              <w:top w:val="single" w:sz="4" w:color="D7DDE0"/>
-              <w:left w:val="single" w:sz="4" w:color="D7DDE0"/>
-              <w:bottom w:val="single" w:sz="4" w:color="D7DDE0"/>
-              <w:right w:val="single" w:sz="4" w:color="D7DDE0"/>
-            </w:tcBorders>
-          </w:tcPr>
-          <w:p>
-            <w:r>
-              <w:rPr>
-                <w:rFonts w:ascii="Calibri" w:hAnsi="Calibri"/>
-                <w:color w:val="1F2937"/>
-                <w:sz w:val="19"/>
-              </w:rPr>
-              <w:t>Use a separate Anthropic organization/API key for HIPAA-ready KCXDocumentor generation.</w:t>
-            </w:r>
-          </w:p>
-        </w:tc>
-      </w:tr>
-      <w:tr>
-        <w:tc>
-          <w:tcPr>
-            <w:tcW w:type="dxa" w:w="3360"/>
-            <w:vAlign w:val="center"/>
-            <w:shd w:fill="F3F4F6"/>
-            <w:tcMar>
-              <w:top w:w="80" w:type="dxa"/>
-              <w:start w:w="120" w:type="dxa"/>
-              <w:bottom w:w="80" w:type="dxa"/>
-              <w:end w:w="120" w:type="dxa"/>
-            </w:tcMar>
-            <w:tcBorders>
-              <w:top w:val="single" w:sz="4" w:color="D7DDE0"/>
-              <w:left w:val="single" w:sz="4" w:color="D7DDE0"/>
-              <w:bottom w:val="single" w:sz="4" w:color="D7DDE0"/>
-              <w:right w:val="single" w:sz="4" w:color="D7DDE0"/>
-            </w:tcBorders>
-          </w:tcPr>
-          <w:p>
-            <w:r>
-              <w:rPr>
-                <w:rFonts w:ascii="Calibri" w:hAnsi="Calibri"/>
-                <w:b/>
-                <w:color w:val="1F2937"/>
-                <w:sz w:val="19"/>
-              </w:rPr>
-              <w:t>Eligible features only</w:t>
-            </w:r>
-          </w:p>
-        </w:tc>
-        <w:tc>
-          <w:tcPr>
-            <w:tcW w:type="dxa" w:w="3360"/>
-            <w:vAlign w:val="center"/>
-            <w:shd w:fill="FFFFFF"/>
-            <w:tcMar>
-              <w:top w:w="80" w:type="dxa"/>
-              <w:start w:w="120" w:type="dxa"/>
-              <w:bottom w:w="80" w:type="dxa"/>
-              <w:end w:w="120" w:type="dxa"/>
-            </w:tcMar>
-            <w:tcBorders>
-              <w:top w:val="single" w:sz="4" w:color="D7DDE0"/>
-              <w:left w:val="single" w:sz="4" w:color="D7DDE0"/>
-              <w:bottom w:val="single" w:sz="4" w:color="D7DDE0"/>
-              <w:right w:val="single" w:sz="4" w:color="D7DDE0"/>
-            </w:tcBorders>
-          </w:tcPr>
-          <w:p>
-            <w:r>
-              <w:rPr>
-                <w:rFonts w:ascii="Calibri" w:hAnsi="Calibri"/>
-                <w:color w:val="1F2937"/>
-                <w:sz w:val="19"/>
-              </w:rPr>
-              <w:t>HIPAA-enabled organizations block non-eligible features; not all API features are covered.</w:t>
-            </w:r>
-          </w:p>
-        </w:tc>
-        <w:tc>
-          <w:tcPr>
-            <w:tcW w:type="dxa" w:w="3360"/>
-            <w:vAlign w:val="center"/>
-            <w:shd w:fill="FFFFFF"/>
-            <w:tcMar>
-              <w:top w:w="80" w:type="dxa"/>
-              <w:start w:w="120" w:type="dxa"/>
-              <w:bottom w:w="80" w:type="dxa"/>
-              <w:end w:w="120" w:type="dxa"/>
-            </w:tcMar>
-            <w:tcBorders>
-              <w:top w:val="single" w:sz="4" w:color="D7DDE0"/>
-              <w:left w:val="single" w:sz="4" w:color="D7DDE0"/>
-              <w:bottom w:val="single" w:sz="4" w:color="D7DDE0"/>
-              <w:right w:val="single" w:sz="4" w:color="D7DDE0"/>
-            </w:tcBorders>
-          </w:tcPr>
-          <w:p>
-            <w:r>
-              <w:rPr>
-                <w:rFonts w:ascii="Calibri" w:hAnsi="Calibri"/>
-                <w:color w:val="1F2937"/>
-                <w:sz w:val="19"/>
-              </w:rPr>
-              <w:t>Keep guide generation on covered Messages API behavior and avoid unsupported features.</w:t>
-            </w:r>
-          </w:p>
-        </w:tc>
-      </w:tr>
-      <w:tr>
-        <w:tc>
-          <w:tcPr>
-            <w:tcW w:type="dxa" w:w="3360"/>
-            <w:vAlign w:val="center"/>
-            <w:shd w:fill="F3F4F6"/>
-            <w:tcMar>
-              <w:top w:w="80" w:type="dxa"/>
-              <w:start w:w="120" w:type="dxa"/>
-              <w:bottom w:w="80" w:type="dxa"/>
-              <w:end w:w="120" w:type="dxa"/>
-            </w:tcMar>
-            <w:tcBorders>
-              <w:top w:val="single" w:sz="4" w:color="D7DDE0"/>
-              <w:left w:val="single" w:sz="4" w:color="D7DDE0"/>
-              <w:bottom w:val="single" w:sz="4" w:color="D7DDE0"/>
-              <w:right w:val="single" w:sz="4" w:color="D7DDE0"/>
-            </w:tcBorders>
-          </w:tcPr>
-          <w:p>
-            <w:r>
-              <w:rPr>
-                <w:rFonts w:ascii="Calibri" w:hAnsi="Calibri"/>
-                <w:b/>
-                <w:color w:val="1F2937"/>
-                <w:sz w:val="19"/>
-              </w:rPr>
-              <w:t>No Console or Workbench use</w:t>
-            </w:r>
-          </w:p>
-        </w:tc>
-        <w:tc>
-          <w:tcPr>
-            <w:tcW w:type="dxa" w:w="3360"/>
-            <w:vAlign w:val="center"/>
-            <w:shd w:fill="FFFFFF"/>
-            <w:tcMar>
-              <w:top w:w="80" w:type="dxa"/>
-              <w:start w:w="120" w:type="dxa"/>
-              <w:bottom w:w="80" w:type="dxa"/>
-              <w:end w:w="120" w:type="dxa"/>
-            </w:tcMar>
-            <w:tcBorders>
-              <w:top w:val="single" w:sz="4" w:color="D7DDE0"/>
-              <w:left w:val="single" w:sz="4" w:color="D7DDE0"/>
-              <w:bottom w:val="single" w:sz="4" w:color="D7DDE0"/>
-              <w:right w:val="single" w:sz="4" w:color="D7DDE0"/>
-            </w:tcBorders>
-          </w:tcPr>
-          <w:p>
-            <w:r>
-              <w:rPr>
-                <w:rFonts w:ascii="Calibri" w:hAnsi="Calibri"/>
-                <w:color w:val="1F2937"/>
-                <w:sz w:val="19"/>
-              </w:rPr>
-              <w:t>Console and Workbench are not covered under the BAA for this API use case.</w:t>
-            </w:r>
-          </w:p>
-        </w:tc>
-        <w:tc>
-          <w:tcPr>
-            <w:tcW w:type="dxa" w:w="3360"/>
-            <w:vAlign w:val="center"/>
-            <w:shd w:fill="FFFFFF"/>
-            <w:tcMar>
-              <w:top w:w="80" w:type="dxa"/>
-              <w:start w:w="120" w:type="dxa"/>
-              <w:bottom w:w="80" w:type="dxa"/>
-              <w:end w:w="120" w:type="dxa"/>
-            </w:tcMar>
-            <w:tcBorders>
-              <w:top w:val="single" w:sz="4" w:color="D7DDE0"/>
-              <w:left w:val="single" w:sz="4" w:color="D7DDE0"/>
-              <w:bottom w:val="single" w:sz="4" w:color="D7DDE0"/>
-              <w:right w:val="single" w:sz="4" w:color="D7DDE0"/>
-            </w:tcBorders>
-          </w:tcPr>
-          <w:p>
-            <w:r>
-              <w:rPr>
-                <w:rFonts w:ascii="Calibri" w:hAnsi="Calibri"/>
-                <w:color w:val="1F2937"/>
-                <w:sz w:val="19"/>
-              </w:rPr>
-              <w:t>Do not paste KCXDocumentor prompt payloads containing PHI into Console, Workbench, or consumer Claude surfaces.</w:t>
-            </w:r>
-          </w:p>
-        </w:tc>
-      </w:tr>
-      <w:tr>
-        <w:tc>
-          <w:tcPr>
-            <w:tcW w:type="dxa" w:w="3360"/>
-            <w:vAlign w:val="center"/>
-            <w:shd w:fill="F3F4F6"/>
-            <w:tcMar>
-              <w:top w:w="80" w:type="dxa"/>
-              <w:start w:w="120" w:type="dxa"/>
-              <w:bottom w:w="80" w:type="dxa"/>
-              <w:end w:w="120" w:type="dxa"/>
-            </w:tcMar>
-            <w:tcBorders>
-              <w:top w:val="single" w:sz="4" w:color="D7DDE0"/>
-              <w:left w:val="single" w:sz="4" w:color="D7DDE0"/>
-              <w:bottom w:val="single" w:sz="4" w:color="D7DDE0"/>
-              <w:right w:val="single" w:sz="4" w:color="D7DDE0"/>
-            </w:tcBorders>
-          </w:tcPr>
-          <w:p>
-            <w:r>
-              <w:rPr>
-                <w:rFonts w:ascii="Calibri" w:hAnsi="Calibri"/>
-                <w:b/>
-                <w:color w:val="1F2937"/>
-                <w:sz w:val="19"/>
-              </w:rPr>
-              <w:t>Third-party integrations</w:t>
-            </w:r>
-          </w:p>
-        </w:tc>
-        <w:tc>
-          <w:tcPr>
-            <w:tcW w:type="dxa" w:w="3360"/>
-            <w:vAlign w:val="center"/>
-            <w:shd w:fill="FFFFFF"/>
-            <w:tcMar>
-              <w:top w:w="80" w:type="dxa"/>
-              <w:start w:w="120" w:type="dxa"/>
-              <w:bottom w:w="80" w:type="dxa"/>
-              <w:end w:w="120" w:type="dxa"/>
-            </w:tcMar>
-            <w:tcBorders>
-              <w:top w:val="single" w:sz="4" w:color="D7DDE0"/>
-              <w:left w:val="single" w:sz="4" w:color="D7DDE0"/>
-              <w:bottom w:val="single" w:sz="4" w:color="D7DDE0"/>
-              <w:right w:val="single" w:sz="4" w:color="D7DDE0"/>
-            </w:tcBorders>
-          </w:tcPr>
-          <w:p>
-            <w:r>
-              <w:rPr>
-                <w:rFonts w:ascii="Calibri" w:hAnsi="Calibri"/>
-                <w:color w:val="1F2937"/>
-                <w:sz w:val="19"/>
-              </w:rPr>
-              <w:t>External tools and third-party data flows are not covered by Anthropic's BAA.</w:t>
-            </w:r>
-          </w:p>
-        </w:tc>
-        <w:tc>
-          <w:tcPr>
-            <w:tcW w:type="dxa" w:w="3360"/>
-            <w:vAlign w:val="center"/>
-            <w:shd w:fill="FFFFFF"/>
-            <w:tcMar>
-              <w:top w:w="80" w:type="dxa"/>
-              <w:start w:w="120" w:type="dxa"/>
-              <w:bottom w:w="80" w:type="dxa"/>
-              <w:end w:w="120" w:type="dxa"/>
-            </w:tcMar>
-            <w:tcBorders>
-              <w:top w:val="single" w:sz="4" w:color="D7DDE0"/>
-              <w:left w:val="single" w:sz="4" w:color="D7DDE0"/>
-              <w:bottom w:val="single" w:sz="4" w:color="D7DDE0"/>
-              <w:right w:val="single" w:sz="4" w:color="D7DDE0"/>
-            </w:tcBorders>
-          </w:tcPr>
-          <w:p>
-            <w:r>
-              <w:rPr>
-                <w:rFonts w:ascii="Calibri" w:hAnsi="Calibri"/>
-                <w:color w:val="1F2937"/>
-                <w:sz w:val="19"/>
-              </w:rPr>
-              <w:t>Keep the Azure Function proxy limited to Anthropic API calls and avoid web search, external MCPs, or third-party tools for PHI content.</w:t>
-            </w:r>
-          </w:p>
-        </w:tc>
-      </w:tr>
-      <w:tr>
-        <w:tc>
-          <w:tcPr>
-            <w:tcW w:type="dxa" w:w="3360"/>
-            <w:vAlign w:val="center"/>
-            <w:shd w:fill="F3F4F6"/>
-            <w:tcMar>
-              <w:top w:w="80" w:type="dxa"/>
-              <w:start w:w="120" w:type="dxa"/>
-              <w:bottom w:w="80" w:type="dxa"/>
-              <w:end w:w="120" w:type="dxa"/>
-            </w:tcMar>
-            <w:tcBorders>
-              <w:top w:val="single" w:sz="4" w:color="D7DDE0"/>
-              <w:left w:val="single" w:sz="4" w:color="D7DDE0"/>
-              <w:bottom w:val="single" w:sz="4" w:color="D7DDE0"/>
-              <w:right w:val="single" w:sz="4" w:color="D7DDE0"/>
-            </w:tcBorders>
-          </w:tcPr>
-          <w:p>
-            <w:r>
-              <w:rPr>
-                <w:rFonts w:ascii="Calibri" w:hAnsi="Calibri"/>
-                <w:b/>
-                <w:color w:val="1F2937"/>
-                <w:sz w:val="19"/>
-              </w:rPr>
-              <w:t>Feature limitations</w:t>
-            </w:r>
-          </w:p>
-        </w:tc>
-        <w:tc>
-          <w:tcPr>
-            <w:tcW w:type="dxa" w:w="3360"/>
-            <w:vAlign w:val="center"/>
-            <w:shd w:fill="FFFFFF"/>
-            <w:tcMar>
-              <w:top w:w="80" w:type="dxa"/>
-              <w:start w:w="120" w:type="dxa"/>
-              <w:bottom w:w="80" w:type="dxa"/>
-              <w:end w:w="120" w:type="dxa"/>
-            </w:tcMar>
-            <w:tcBorders>
-              <w:top w:val="single" w:sz="4" w:color="D7DDE0"/>
-              <w:left w:val="single" w:sz="4" w:color="D7DDE0"/>
-              <w:bottom w:val="single" w:sz="4" w:color="D7DDE0"/>
-              <w:right w:val="single" w:sz="4" w:color="D7DDE0"/>
-            </w:tcBorders>
-          </w:tcPr>
-          <w:p>
-            <w:r>
-              <w:rPr>
-                <w:rFonts w:ascii="Calibri" w:hAnsi="Calibri"/>
-                <w:color w:val="1F2937"/>
-                <w:sz w:val="19"/>
-              </w:rPr>
-              <w:t>Batch API, Files API, Skills API, Code Execution, Computer Use, and Web Fetch are not covered for HIPAA-ready API users per Anthropic's BAA coverage table.</w:t>
-            </w:r>
-          </w:p>
-        </w:tc>
-        <w:tc>
-          <w:tcPr>
-            <w:tcW w:type="dxa" w:w="3360"/>
-            <w:vAlign w:val="center"/>
-            <w:shd w:fill="FFFFFF"/>
-            <w:tcMar>
-              <w:top w:w="80" w:type="dxa"/>
-              <w:start w:w="120" w:type="dxa"/>
-              <w:bottom w:w="80" w:type="dxa"/>
-              <w:end w:w="120" w:type="dxa"/>
-            </w:tcMar>
-            <w:tcBorders>
-              <w:top w:val="single" w:sz="4" w:color="D7DDE0"/>
-              <w:left w:val="single" w:sz="4" w:color="D7DDE0"/>
-              <w:bottom w:val="single" w:sz="4" w:color="D7DDE0"/>
-              <w:right w:val="single" w:sz="4" w:color="D7DDE0"/>
-            </w:tcBorders>
-          </w:tcPr>
-          <w:p>
-            <w:r>
-              <w:rPr>
-                <w:rFonts w:ascii="Calibri" w:hAnsi="Calibri"/>
-                <w:color w:val="1F2937"/>
-                <w:sz w:val="19"/>
-              </w:rPr>
-              <w:t>Do not use these features for PHI workflows unless Anthropic contract terms later explicitly cover them.</w:t>
-            </w:r>
-          </w:p>
-        </w:tc>
-      </w:tr>
-      <w:tr>
-        <w:tc>
-          <w:tcPr>
-            <w:tcW w:type="dxa" w:w="3360"/>
-            <w:vAlign w:val="center"/>
-            <w:shd w:fill="F3F4F6"/>
-            <w:tcMar>
-              <w:top w:w="80" w:type="dxa"/>
-              <w:start w:w="120" w:type="dxa"/>
-              <w:bottom w:w="80" w:type="dxa"/>
-              <w:end w:w="120" w:type="dxa"/>
-            </w:tcMar>
-            <w:tcBorders>
-              <w:top w:val="single" w:sz="4" w:color="D7DDE0"/>
-              <w:left w:val="single" w:sz="4" w:color="D7DDE0"/>
-              <w:bottom w:val="single" w:sz="4" w:color="D7DDE0"/>
-              <w:right w:val="single" w:sz="4" w:color="D7DDE0"/>
-            </w:tcBorders>
-          </w:tcPr>
-          <w:p>
-            <w:r>
-              <w:rPr>
-                <w:rFonts w:ascii="Calibri" w:hAnsi="Calibri"/>
-                <w:b/>
-                <w:color w:val="1F2937"/>
-                <w:sz w:val="19"/>
-              </w:rPr>
-              <w:t>Schema restrictions</w:t>
-            </w:r>
-          </w:p>
-        </w:tc>
-        <w:tc>
-          <w:tcPr>
-            <w:tcW w:type="dxa" w:w="3360"/>
-            <w:vAlign w:val="center"/>
-            <w:shd w:fill="FFFFFF"/>
-            <w:tcMar>
-              <w:top w:w="80" w:type="dxa"/>
-              <w:start w:w="120" w:type="dxa"/>
-              <w:bottom w:w="80" w:type="dxa"/>
-              <w:end w:w="120" w:type="dxa"/>
-            </w:tcMar>
-            <w:tcBorders>
-              <w:top w:val="single" w:sz="4" w:color="D7DDE0"/>
-              <w:left w:val="single" w:sz="4" w:color="D7DDE0"/>
-              <w:bottom w:val="single" w:sz="4" w:color="D7DDE0"/>
-              <w:right w:val="single" w:sz="4" w:color="D7DDE0"/>
-            </w:tcBorders>
-          </w:tcPr>
-          <w:p>
-            <w:r>
-              <w:rPr>
-                <w:rFonts w:ascii="Calibri" w:hAnsi="Calibri"/>
-                <w:color w:val="1F2937"/>
-                <w:sz w:val="19"/>
-              </w:rPr>
-              <w:t>Anthropic warns not to place PHI in JSON schema definitions, enum values, constants, or patterns because those cached schemas do not receive the same PHI protections as message content.</w:t>
-            </w:r>
-          </w:p>
-        </w:tc>
-        <w:tc>
-          <w:tcPr>
-            <w:tcW w:type="dxa" w:w="3360"/>
-            <w:vAlign w:val="center"/>
-            <w:shd w:fill="FFFFFF"/>
-            <w:tcMar>
-              <w:top w:w="80" w:type="dxa"/>
-              <w:start w:w="120" w:type="dxa"/>
-              <w:bottom w:w="80" w:type="dxa"/>
-              <w:end w:w="120" w:type="dxa"/>
-            </w:tcMar>
-            <w:tcBorders>
-              <w:top w:val="single" w:sz="4" w:color="D7DDE0"/>
-              <w:left w:val="single" w:sz="4" w:color="D7DDE0"/>
-              <w:bottom w:val="single" w:sz="4" w:color="D7DDE0"/>
-              <w:right w:val="single" w:sz="4" w:color="D7DDE0"/>
-            </w:tcBorders>
-          </w:tcPr>
-          <w:p>
-            <w:r>
-              <w:rPr>
-                <w:rFonts w:ascii="Calibri" w:hAnsi="Calibri"/>
-                <w:color w:val="1F2937"/>
-                <w:sz w:val="19"/>
-              </w:rPr>
-              <w:t>Ensure KCXDocumentor schemas and tool definitions are generic and never patient- or transaction-specific.</w:t>
+              <w:t>KCXDocumentor should keep guide generation limited to Messages-style behavior and avoid Files API, tools, web fetch, MCP connectors, and agent features for PHI workflows unless explicitly approved.</w:t>
             </w:r>
           </w:p>
         </w:tc>
@@ -3424,7 +3702,7 @@
         <w:pStyle w:val="Heading1"/>
       </w:pPr>
       <w:r>
-        <w:t>Recommended Product Controls Before PHI Use</w:t>
+        <w:t>Required Controls Before PHI Use</w:t>
       </w:r>
     </w:p>
     <w:p>
@@ -3432,7 +3710,7 @@
         <w:pStyle w:val="ListBullet"/>
       </w:pPr>
       <w:r>
-        <w:t>Create a PHI mode that blocks guide generation unless the configured API endpoint is tied to a HIPAA-ready Anthropic organization under a signed BAA.</w:t>
+        <w:t>Create a PHI mode that blocks guide generation unless the approved provider path, terms, and compliance controls are active.</w:t>
       </w:r>
     </w:p>
     <w:p>
@@ -3440,7 +3718,7 @@
         <w:pStyle w:val="ListBullet"/>
       </w:pPr>
       <w:r>
-        <w:t>Add a preflight warning that identifies transcript, OCR, reviewer notes, and approved screenshots as possible PHI/PII transmission points.</w:t>
+        <w:t>Add a preflight warning that identifies transcript, OCR, reviewer notes, approved screenshots, document titles, and usage metadata as possible PHI/PII exposure points.</w:t>
       </w:r>
     </w:p>
     <w:p>
@@ -3448,7 +3726,7 @@
         <w:pStyle w:val="ListBullet"/>
       </w:pPr>
       <w:r>
-        <w:t>Add redaction or masking options for patient names, dates of birth, prescription identifiers, phone numbers, addresses, email addresses, MRNs, and account numbers before prompt assembly.</w:t>
+        <w:t>Add local redaction or masking options for patient names, dates of birth, prescription identifiers, phone numbers, addresses, email addresses, MRNs, account numbers, and customer-specific support identifiers before prompt assembly.</w:t>
       </w:r>
     </w:p>
     <w:p>
@@ -3456,7 +3734,7 @@
         <w:pStyle w:val="ListBullet"/>
       </w:pPr>
       <w:r>
-        <w:t>Maintain the current backend proxy pattern so API keys are never exposed in browser JavaScript.</w:t>
+        <w:t>Keep API keys only in Azure Function App settings. Do not store Anthropic or Azure Foundry provider keys on workstations.</w:t>
       </w:r>
     </w:p>
     <w:p>
@@ -3464,7 +3742,7 @@
         <w:pStyle w:val="ListBullet"/>
       </w:pPr>
       <w:r>
-        <w:t>Keep raw recordings, extracted frames, and generated files in mapped local folders with workstation access controls.</w:t>
+        <w:t>Keep raw recordings, extracted frames, processed traces, generated DOCX files, and QA output in mapped local folders with workstation access controls.</w:t>
       </w:r>
     </w:p>
     <w:p>
@@ -3472,7 +3750,7 @@
         <w:pStyle w:val="ListBullet"/>
       </w:pPr>
       <w:r>
-        <w:t>Log only operational metadata needed for audit and cost reporting; avoid storing PHI in cloud usage records, file names, session names, or telemetry.</w:t>
+        <w:t>Log only operational metadata needed for audit and cost reporting. Avoid PHI in cloud usage records, file names, session names, generated titles, or telemetry.</w:t>
       </w:r>
     </w:p>
     <w:p>
@@ -3480,7 +3758,7 @@
         <w:pStyle w:val="ListBullet"/>
       </w:pPr>
       <w:r>
-        <w:t>Disable or block unsupported Anthropic features for KCXDocumentor PHI workflows, including Files API, batch processing, web fetch, external tools, and non-covered beta features.</w:t>
+        <w:t>Disable or block unsupported model features for PHI workflows, including Files API, batch processing, web fetch, external tools, MCP connectors, code execution, and non-covered beta features unless Compliance explicitly approves them.</w:t>
       </w:r>
     </w:p>
     <w:p>
@@ -3488,7 +3766,7 @@
         <w:pStyle w:val="ListBullet"/>
       </w:pPr>
       <w:r>
-        <w:t>Document a user-facing rule: recordings used for customer-facing guide generation should be de-identified unless the HIPAA-ready/BAA path is active.</w:t>
+        <w:t>Document a user-facing pilot rule: recordings used for guide generation must be synthetic, internal-only, or de-identified unless the PHI-ready path is approved.</w:t>
       </w:r>
     </w:p>
     <w:p>
@@ -3563,7 +3841,7 @@
                 <w:b/>
                 <w:color w:val="FFFFFF"/>
               </w:rPr>
-              <w:t>Allowed For Demo?</w:t>
+              <w:t>Allowed For Pilot?</w:t>
             </w:r>
           </w:p>
         </w:tc>
@@ -3736,7 +4014,7 @@
                 <w:color w:val="1F2937"/>
                 <w:sz w:val="19"/>
               </w:rPr>
-              <w:t>Use current API path with local-first controls and reviewer QA.</w:t>
+              <w:t>Use current Azure Function and Azure Foundry Claude path with local-first controls and reviewer QA.</w:t>
             </w:r>
           </w:p>
         </w:tc>
@@ -3855,7 +4133,7 @@
                 <w:color w:val="1F2937"/>
                 <w:sz w:val="19"/>
               </w:rPr>
-              <w:t>Minimize, redact, and confirm business approval before API generation.</w:t>
+              <w:t>Minimize, redact, and confirm business approval before generation.</w:t>
             </w:r>
           </w:p>
         </w:tc>
@@ -3945,7 +4223,7 @@
                 <w:color w:val="1F2937"/>
                 <w:sz w:val="19"/>
               </w:rPr>
-              <w:t>Not under standard API path</w:t>
+              <w:t>Not yet approved</w:t>
             </w:r>
           </w:p>
         </w:tc>
@@ -3974,7 +4252,7 @@
                 <w:color w:val="1F2937"/>
                 <w:sz w:val="19"/>
               </w:rPr>
-              <w:t>Require signed BAA, HIPAA-ready API organization, and PHI mode controls.</w:t>
+              <w:t>Require Compliance approval of Foundry Claude terms, PHI mode, redaction checks, and logging controls.</w:t>
             </w:r>
           </w:p>
         </w:tc>
@@ -4093,7 +4371,126 @@
                 <w:color w:val="1F2937"/>
                 <w:sz w:val="19"/>
               </w:rPr>
-              <w:t>Use HIPAA-ready API access or ensure complete de-identification before generation.</w:t>
+              <w:t>Use the approved PHI-ready provider path or ensure complete de-identification before generation.</w:t>
+            </w:r>
+          </w:p>
+        </w:tc>
+      </w:tr>
+      <w:tr>
+        <w:tc>
+          <w:tcPr>
+            <w:tcW w:type="dxa" w:w="2520"/>
+            <w:vAlign w:val="center"/>
+            <w:shd w:fill="F3F4F6"/>
+            <w:tcMar>
+              <w:top w:w="80" w:type="dxa"/>
+              <w:start w:w="120" w:type="dxa"/>
+              <w:bottom w:w="80" w:type="dxa"/>
+              <w:end w:w="120" w:type="dxa"/>
+            </w:tcMar>
+            <w:tcBorders>
+              <w:top w:val="single" w:sz="4" w:color="D7DDE0"/>
+              <w:left w:val="single" w:sz="4" w:color="D7DDE0"/>
+              <w:bottom w:val="single" w:sz="4" w:color="D7DDE0"/>
+              <w:right w:val="single" w:sz="4" w:color="D7DDE0"/>
+            </w:tcBorders>
+          </w:tcPr>
+          <w:p>
+            <w:r>
+              <w:rPr>
+                <w:rFonts w:ascii="Calibri" w:hAnsi="Calibri"/>
+                <w:b/>
+                <w:color w:val="1F2937"/>
+                <w:sz w:val="19"/>
+              </w:rPr>
+              <w:t>Direct first-party Anthropic API production path</w:t>
+            </w:r>
+          </w:p>
+        </w:tc>
+        <w:tc>
+          <w:tcPr>
+            <w:tcW w:type="dxa" w:w="2520"/>
+            <w:vAlign w:val="center"/>
+            <w:shd w:fill="FFFFFF"/>
+            <w:tcMar>
+              <w:top w:w="80" w:type="dxa"/>
+              <w:start w:w="120" w:type="dxa"/>
+              <w:bottom w:w="80" w:type="dxa"/>
+              <w:end w:w="120" w:type="dxa"/>
+            </w:tcMar>
+            <w:tcBorders>
+              <w:top w:val="single" w:sz="4" w:color="D7DDE0"/>
+              <w:left w:val="single" w:sz="4" w:color="D7DDE0"/>
+              <w:bottom w:val="single" w:sz="4" w:color="D7DDE0"/>
+              <w:right w:val="single" w:sz="4" w:color="D7DDE0"/>
+            </w:tcBorders>
+          </w:tcPr>
+          <w:p>
+            <w:r>
+              <w:rPr>
+                <w:rFonts w:ascii="Calibri" w:hAnsi="Calibri"/>
+                <w:color w:val="1F2937"/>
+                <w:sz w:val="19"/>
+              </w:rPr>
+              <w:t>No</w:t>
+            </w:r>
+          </w:p>
+        </w:tc>
+        <w:tc>
+          <w:tcPr>
+            <w:tcW w:type="dxa" w:w="2520"/>
+            <w:vAlign w:val="center"/>
+            <w:shd w:fill="FFFFFF"/>
+            <w:tcMar>
+              <w:top w:w="80" w:type="dxa"/>
+              <w:start w:w="120" w:type="dxa"/>
+              <w:bottom w:w="80" w:type="dxa"/>
+              <w:end w:w="120" w:type="dxa"/>
+            </w:tcMar>
+            <w:tcBorders>
+              <w:top w:val="single" w:sz="4" w:color="D7DDE0"/>
+              <w:left w:val="single" w:sz="4" w:color="D7DDE0"/>
+              <w:bottom w:val="single" w:sz="4" w:color="D7DDE0"/>
+              <w:right w:val="single" w:sz="4" w:color="D7DDE0"/>
+            </w:tcBorders>
+          </w:tcPr>
+          <w:p>
+            <w:r>
+              <w:rPr>
+                <w:rFonts w:ascii="Calibri" w:hAnsi="Calibri"/>
+                <w:color w:val="1F2937"/>
+                <w:sz w:val="19"/>
+              </w:rPr>
+              <w:t>No</w:t>
+            </w:r>
+          </w:p>
+        </w:tc>
+        <w:tc>
+          <w:tcPr>
+            <w:tcW w:type="dxa" w:w="2520"/>
+            <w:vAlign w:val="center"/>
+            <w:shd w:fill="FFFFFF"/>
+            <w:tcMar>
+              <w:top w:w="80" w:type="dxa"/>
+              <w:start w:w="120" w:type="dxa"/>
+              <w:bottom w:w="80" w:type="dxa"/>
+              <w:end w:w="120" w:type="dxa"/>
+            </w:tcMar>
+            <w:tcBorders>
+              <w:top w:val="single" w:sz="4" w:color="D7DDE0"/>
+              <w:left w:val="single" w:sz="4" w:color="D7DDE0"/>
+              <w:bottom w:val="single" w:sz="4" w:color="D7DDE0"/>
+              <w:right w:val="single" w:sz="4" w:color="D7DDE0"/>
+            </w:tcBorders>
+          </w:tcPr>
+          <w:p>
+            <w:r>
+              <w:rPr>
+                <w:rFonts w:ascii="Calibri" w:hAnsi="Calibri"/>
+                <w:color w:val="1F2937"/>
+                <w:sz w:val="19"/>
+              </w:rPr>
+              <w:t>Do not use unless a separate approved architecture, BAA, and key-management model are established.</w:t>
             </w:r>
           </w:p>
         </w:tc>
@@ -4113,7 +4510,7 @@
         <w:pStyle w:val="ListBullet"/>
       </w:pPr>
       <w:r>
-        <w:t>Decide whether KCXDocumentor will be permitted to process PHI-bearing recordings, or whether all pilot recordings must be de-identified.</w:t>
+        <w:t>Confirm whether KCXDocumentor pilot recordings must be fully de-identified or may include limited non-PHI business context.</w:t>
       </w:r>
     </w:p>
     <w:p>
@@ -4121,7 +4518,7 @@
         <w:pStyle w:val="ListBullet"/>
       </w:pPr>
       <w:r>
-        <w:t>If PHI use is expected, start the Anthropic BAA and HIPAA-ready API enablement process before expanding the pilot.</w:t>
+        <w:t>Assign Security and Compliance review of the Azure Foundry Claude Marketplace terms, Anthropic processor terms, Microsoft DPA posture, region behavior, and Marketplace billing implications.</w:t>
       </w:r>
     </w:p>
     <w:p>
@@ -4129,7 +4526,7 @@
         <w:pStyle w:val="ListBullet"/>
       </w:pPr>
       <w:r>
-        <w:t>Assign Security/Compliance review of KCXDocumentor's prompt payload, logging, storage, and UI warnings.</w:t>
+        <w:t>Decide whether the organization requires a formal Anthropic BAA path, a Microsoft/Marketplace confirmation path, or both before PHI-bearing production use.</w:t>
       </w:r>
     </w:p>
     <w:p>
@@ -4137,7 +4534,7 @@
         <w:pStyle w:val="ListBullet"/>
       </w:pPr>
       <w:r>
-        <w:t>Define whether ZDR is required as an additional contractual control even though Anthropic now documents HIPAA-ready API access separately from ZDR.</w:t>
+        <w:t>Approve or defer PHI mode, local redaction checks, metadata hygiene checks, and unsupported-feature blocking.</w:t>
       </w:r>
     </w:p>
     <w:p>
@@ -4145,7 +4542,7 @@
         <w:pStyle w:val="ListBullet"/>
       </w:pPr>
       <w:r>
-        <w:t>Approve product work for PHI mode, redaction checks, and unsupported-feature blocking before regulated production use.</w:t>
+        <w:t>Confirm that the target Azure subscription payment method covers Marketplace charges before moving production usage to a company subscription.</w:t>
       </w:r>
     </w:p>
     <w:p>
@@ -4250,7 +4647,7 @@
                 <w:color w:val="1F2937"/>
                 <w:sz w:val="19"/>
               </w:rPr>
-              <w:t>Anthropic Commercial Terms of Service, effective June 17, 2025</w:t>
+              <w:t>Microsoft Learn: Data, privacy, and security for Anthropic Claude models in Microsoft Foundry, updated 2026-05-18</w:t>
             </w:r>
           </w:p>
         </w:tc>
@@ -4279,7 +4676,68 @@
                 <w:color w:val="1F2937"/>
                 <w:sz w:val="19"/>
               </w:rPr>
-              <w:t>Customer content ownership, no model training on customer content, data processing and confidentiality obligations.</w:t>
+              <w:t>Anthropic processor role, Microsoft deployment infrastructure role, Marketplace information sharing, and regional processing caveat.</w:t>
+            </w:r>
+          </w:p>
+        </w:tc>
+      </w:tr>
+      <w:tr>
+        <w:tc>
+          <w:tcPr>
+            <w:tcW w:type="dxa" w:w="5040"/>
+            <w:vAlign w:val="center"/>
+            <w:shd w:fill="F3F4F6"/>
+            <w:tcMar>
+              <w:top w:w="80" w:type="dxa"/>
+              <w:start w:w="120" w:type="dxa"/>
+              <w:bottom w:w="80" w:type="dxa"/>
+              <w:end w:w="120" w:type="dxa"/>
+            </w:tcMar>
+            <w:tcBorders>
+              <w:top w:val="single" w:sz="4" w:color="D7DDE0"/>
+              <w:left w:val="single" w:sz="4" w:color="D7DDE0"/>
+              <w:bottom w:val="single" w:sz="4" w:color="D7DDE0"/>
+              <w:right w:val="single" w:sz="4" w:color="D7DDE0"/>
+            </w:tcBorders>
+          </w:tcPr>
+          <w:p>
+            <w:r>
+              <w:rPr>
+                <w:rFonts w:ascii="Calibri" w:hAnsi="Calibri"/>
+                <w:b/>
+                <w:color w:val="1F2937"/>
+                <w:sz w:val="19"/>
+              </w:rPr>
+              <w:t>Microsoft Product Terms for Microsoft Azure</w:t>
+            </w:r>
+          </w:p>
+        </w:tc>
+        <w:tc>
+          <w:tcPr>
+            <w:tcW w:type="dxa" w:w="5040"/>
+            <w:vAlign w:val="center"/>
+            <w:shd w:fill="FFFFFF"/>
+            <w:tcMar>
+              <w:top w:w="80" w:type="dxa"/>
+              <w:start w:w="120" w:type="dxa"/>
+              <w:bottom w:w="80" w:type="dxa"/>
+              <w:end w:w="120" w:type="dxa"/>
+            </w:tcMar>
+            <w:tcBorders>
+              <w:top w:val="single" w:sz="4" w:color="D7DDE0"/>
+              <w:left w:val="single" w:sz="4" w:color="D7DDE0"/>
+              <w:bottom w:val="single" w:sz="4" w:color="D7DDE0"/>
+              <w:right w:val="single" w:sz="4" w:color="D7DDE0"/>
+            </w:tcBorders>
+          </w:tcPr>
+          <w:p>
+            <w:r>
+              <w:rPr>
+                <w:rFonts w:ascii="Calibri" w:hAnsi="Calibri"/>
+                <w:color w:val="1F2937"/>
+                <w:sz w:val="19"/>
+              </w:rPr>
+              <w:t>Marketplace terms, Foundry Models distinctions, and separate terms for third-party models and Marketplace products.</w:t>
             </w:r>
           </w:p>
         </w:tc>
@@ -4340,7 +4798,7 @@
                 <w:color w:val="1F2937"/>
                 <w:sz w:val="19"/>
               </w:rPr>
-              <w:t>Standard retention, zero data retention, HIPAA readiness, PHI handling guidelines, unsupported features, and backend proxy guidance.</w:t>
+              <w:t>Standard retention, zero data retention, HIPAA-ready API access, PHI handling guidance, and unsupported feature eligibility.</w:t>
             </w:r>
           </w:p>
         </w:tc>
@@ -4372,7 +4830,7 @@
                 <w:color w:val="1F2937"/>
                 <w:sz w:val="19"/>
               </w:rPr>
-              <w:t>Anthropic Privacy Center: How long do you store my organization's data?</w:t>
+              <w:t>Anthropic Commercial Terms and Data Processing Addendum</w:t>
             </w:r>
           </w:p>
         </w:tc>
@@ -4401,7 +4859,7 @@
                 <w:color w:val="1F2937"/>
                 <w:sz w:val="19"/>
               </w:rPr>
-              <w:t>30-day API retention, usage-policy exception retention, feedback retention, and legal exceptions.</w:t>
+              <w:t>Customer content ownership, model-training restrictions, and Anthropic processor terms for commercial API use.</w:t>
             </w:r>
           </w:p>
         </w:tc>
@@ -4433,7 +4891,7 @@
                 <w:color w:val="1F2937"/>
                 <w:sz w:val="19"/>
               </w:rPr>
-              <w:t>Anthropic Privacy Center: Zero data retention agreement scope</w:t>
+              <w:t>KCXDocumentor implementation plan</w:t>
             </w:r>
           </w:p>
         </w:tc>
@@ -4462,74 +4920,26 @@
                 <w:color w:val="1F2937"/>
                 <w:sz w:val="19"/>
               </w:rPr>
-              <w:t>ZDR scope, covered products, and limitations.</w:t>
-            </w:r>
-          </w:p>
-        </w:tc>
-      </w:tr>
-      <w:tr>
-        <w:tc>
-          <w:tcPr>
-            <w:tcW w:type="dxa" w:w="5040"/>
-            <w:vAlign w:val="center"/>
-            <w:shd w:fill="F3F4F6"/>
-            <w:tcMar>
-              <w:top w:w="80" w:type="dxa"/>
-              <w:start w:w="120" w:type="dxa"/>
-              <w:bottom w:w="80" w:type="dxa"/>
-              <w:end w:w="120" w:type="dxa"/>
-            </w:tcMar>
-            <w:tcBorders>
-              <w:top w:val="single" w:sz="4" w:color="D7DDE0"/>
-              <w:left w:val="single" w:sz="4" w:color="D7DDE0"/>
-              <w:bottom w:val="single" w:sz="4" w:color="D7DDE0"/>
-              <w:right w:val="single" w:sz="4" w:color="D7DDE0"/>
-            </w:tcBorders>
-          </w:tcPr>
-          <w:p>
-            <w:r>
-              <w:rPr>
-                <w:rFonts w:ascii="Calibri" w:hAnsi="Calibri"/>
-                <w:b/>
-                <w:color w:val="1F2937"/>
-                <w:sz w:val="19"/>
-              </w:rPr>
-              <w:t>Claude Help Center: Business Associate Agreements for Commercial Customers</w:t>
-            </w:r>
-          </w:p>
-        </w:tc>
-        <w:tc>
-          <w:tcPr>
-            <w:tcW w:type="dxa" w:w="5040"/>
-            <w:vAlign w:val="center"/>
-            <w:shd w:fill="FFFFFF"/>
-            <w:tcMar>
-              <w:top w:w="80" w:type="dxa"/>
-              <w:start w:w="120" w:type="dxa"/>
-              <w:bottom w:w="80" w:type="dxa"/>
-              <w:end w:w="120" w:type="dxa"/>
-            </w:tcMar>
-            <w:tcBorders>
-              <w:top w:val="single" w:sz="4" w:color="D7DDE0"/>
-              <w:left w:val="single" w:sz="4" w:color="D7DDE0"/>
-              <w:bottom w:val="single" w:sz="4" w:color="D7DDE0"/>
-              <w:right w:val="single" w:sz="4" w:color="D7DDE0"/>
-            </w:tcBorders>
-          </w:tcPr>
-          <w:p>
-            <w:r>
-              <w:rPr>
-                <w:rFonts w:ascii="Calibri" w:hAnsi="Calibri"/>
-                <w:color w:val="1F2937"/>
-                <w:sz w:val="19"/>
-              </w:rPr>
-              <w:t>BAA availability, required activation, covered and excluded product surfaces, and API feature coverage.</w:t>
+              <w:t>Current local-first architecture, Azure Function proxy, Azure Foundry provider settings, Cosmos usage reporting, and queue/token controls.</w:t>
             </w:r>
           </w:p>
         </w:tc>
       </w:tr>
     </w:tbl>
     <w:p/>
+    <w:p>
+      <w:pPr>
+        <w:pStyle w:val="Heading1"/>
+      </w:pPr>
+      <w:r>
+        <w:t>Recipe Alignment</w:t>
+      </w:r>
+    </w:p>
+    <w:p>
+      <w:r>
+        <w:t>Built as a keycentrix internal artifact using the DamienDev document recipe structure: control metadata, version history, purpose, scope, audience, governance, process detail, decision matrix, and source appendix.</w:t>
+      </w:r>
+    </w:p>
     <w:sectPr>
       <w:headerReference w:type="default" r:id="rId9"/>
       <w:footerReference w:type="default" r:id="rId10"/>
@@ -4574,7 +4984,7 @@
         <w:color w:val="6B7280"/>
         <w:sz w:val="17"/>
       </w:rPr>
-      <w:t>KCXDocumentor - Anthropic API Data Protection Brief</w:t>
+      <w:t>KCXDocumentor - Azure Foundry Claude Data Protection Brief</w:t>
     </w:r>
   </w:p>
 </w:hdr>

</xml_diff>